<commit_message>
Added to the report
</commit_message>
<xml_diff>
--- a/460_Project_Report_HunterA_DiegoB.docx
+++ b/460_Project_Report_HunterA_DiegoB.docx
@@ -337,10 +337,117 @@
       <w:pPr>
         <w:rPr>
           <w:rFonts w:ascii="Times New Roman" w:hAnsi="Times New Roman" w:cs="Times New Roman"/>
+        </w:rPr>
+      </w:pPr>
+      <w:r>
+        <w:rPr>
+          <w:rFonts w:ascii="Times New Roman" w:hAnsi="Times New Roman" w:cs="Times New Roman"/>
+        </w:rPr>
+        <w:t xml:space="preserve">A car dealership under the company name “HD Car Wholesale”, wants to make a website for displaying its inventory of vehicles for sale. This is both to assist customers to find cars they like before they come to the dealership and to allow for inventory tracking for employees. </w:t>
+      </w:r>
+    </w:p>
+    <w:p>
+      <w:pPr>
+        <w:rPr>
+          <w:rFonts w:ascii="Times New Roman" w:hAnsi="Times New Roman" w:cs="Times New Roman"/>
           <w:b/>
           <w:bCs/>
         </w:rPr>
       </w:pPr>
+      <w:r>
+        <w:rPr>
+          <w:rFonts w:ascii="Times New Roman" w:hAnsi="Times New Roman" w:cs="Times New Roman"/>
+        </w:rPr>
+        <w:t xml:space="preserve">Some of the data stored on each vehicle is the color, year, value, make, model, gallons per mile, mileage, license plate digits, and </w:t>
+      </w:r>
+      <w:proofErr w:type="gramStart"/>
+      <w:r>
+        <w:rPr>
+          <w:rFonts w:ascii="Times New Roman" w:hAnsi="Times New Roman" w:cs="Times New Roman"/>
+        </w:rPr>
+        <w:t>vin</w:t>
+      </w:r>
+      <w:proofErr w:type="gramEnd"/>
+      <w:r>
+        <w:rPr>
+          <w:rFonts w:ascii="Times New Roman" w:hAnsi="Times New Roman" w:cs="Times New Roman"/>
+        </w:rPr>
+        <w:t xml:space="preserve">. These are all attributes that the customers can use to filter their searches, and the employees can use to track which vehicles are and aren’t </w:t>
+      </w:r>
+      <w:r>
+        <w:rPr>
+          <w:rFonts w:ascii="Times New Roman" w:hAnsi="Times New Roman" w:cs="Times New Roman"/>
+        </w:rPr>
+        <w:t>on</w:t>
+      </w:r>
+      <w:r>
+        <w:rPr>
+          <w:rFonts w:ascii="Times New Roman" w:hAnsi="Times New Roman" w:cs="Times New Roman"/>
+        </w:rPr>
+        <w:t xml:space="preserve"> display. There will be a login for employees to remove</w:t>
+      </w:r>
+      <w:r>
+        <w:rPr>
+          <w:rFonts w:ascii="Times New Roman" w:hAnsi="Times New Roman" w:cs="Times New Roman"/>
+        </w:rPr>
+        <w:t xml:space="preserve">, </w:t>
+      </w:r>
+      <w:r>
+        <w:rPr>
+          <w:rFonts w:ascii="Times New Roman" w:hAnsi="Times New Roman" w:cs="Times New Roman"/>
+        </w:rPr>
+        <w:t>add</w:t>
+      </w:r>
+      <w:r>
+        <w:rPr>
+          <w:rFonts w:ascii="Times New Roman" w:hAnsi="Times New Roman" w:cs="Times New Roman"/>
+        </w:rPr>
+        <w:t>, and update</w:t>
+      </w:r>
+      <w:r>
+        <w:rPr>
+          <w:rFonts w:ascii="Times New Roman" w:hAnsi="Times New Roman" w:cs="Times New Roman"/>
+        </w:rPr>
+        <w:t xml:space="preserve"> vehicles </w:t>
+      </w:r>
+      <w:r>
+        <w:rPr>
+          <w:rFonts w:ascii="Times New Roman" w:hAnsi="Times New Roman" w:cs="Times New Roman"/>
+        </w:rPr>
+        <w:t>on/</w:t>
+      </w:r>
+      <w:r>
+        <w:rPr>
+          <w:rFonts w:ascii="Times New Roman" w:hAnsi="Times New Roman" w:cs="Times New Roman"/>
+        </w:rPr>
+        <w:t>to the listing when they are received or sold off. The passwords will be hashed, salted, and peppered for security purposes. There is also a record of all employee login(s) and action(s) for investigation purposes.</w:t>
+      </w:r>
+      <w:r>
+        <w:rPr>
+          <w:rFonts w:ascii="Times New Roman" w:hAnsi="Times New Roman" w:cs="Times New Roman"/>
+        </w:rPr>
+        <w:t xml:space="preserve"> No way of altering or viewing the action report records will be provided through this website, only database administrators on the </w:t>
+      </w:r>
+      <w:proofErr w:type="gramStart"/>
+      <w:r>
+        <w:rPr>
+          <w:rFonts w:ascii="Times New Roman" w:hAnsi="Times New Roman" w:cs="Times New Roman"/>
+        </w:rPr>
+        <w:t>backend</w:t>
+      </w:r>
+      <w:proofErr w:type="gramEnd"/>
+      <w:r>
+        <w:rPr>
+          <w:rFonts w:ascii="Times New Roman" w:hAnsi="Times New Roman" w:cs="Times New Roman"/>
+        </w:rPr>
+        <w:t xml:space="preserve"> will be capable of viewing the data (and no one can remove it</w:t>
+      </w:r>
+      <w:r>
+        <w:rPr>
+          <w:rFonts w:ascii="Times New Roman" w:hAnsi="Times New Roman" w:cs="Times New Roman"/>
+        </w:rPr>
+        <w:t>) for investigative purposes.</w:t>
+      </w:r>
     </w:p>
     <w:p>
       <w:pPr>
@@ -497,38 +604,2168 @@
     </w:p>
     <w:p>
       <w:pPr>
+        <w:jc w:val="center"/>
         <w:rPr>
           <w:rFonts w:ascii="Times New Roman" w:hAnsi="Times New Roman" w:cs="Times New Roman"/>
           <w:b/>
           <w:bCs/>
         </w:rPr>
       </w:pPr>
-    </w:p>
-    <w:p>
-      <w:pPr>
+      <w:r>
         <w:rPr>
           <w:rFonts w:ascii="Times New Roman" w:hAnsi="Times New Roman" w:cs="Times New Roman"/>
           <w:b/>
           <w:bCs/>
         </w:rPr>
-      </w:pPr>
-    </w:p>
-    <w:p>
-      <w:pPr>
+        <w:lastRenderedPageBreak/>
+        <w:t>Data Modeling</w:t>
+      </w:r>
+    </w:p>
+    <w:p>
+      <w:pPr>
+        <w:rPr>
+          <w:rFonts w:ascii="Times New Roman" w:hAnsi="Times New Roman" w:cs="Times New Roman"/>
+        </w:rPr>
+      </w:pPr>
+      <w:r>
+        <w:rPr>
+          <w:rFonts w:ascii="Times New Roman" w:hAnsi="Times New Roman" w:cs="Times New Roman"/>
+        </w:rPr>
+        <w:t>The low-level relational and conceptual model of the database is as follows:</w:t>
+      </w:r>
+    </w:p>
+    <w:p>
+      <w:pPr>
+        <w:rPr>
+          <w:rFonts w:ascii="Times New Roman" w:hAnsi="Times New Roman" w:cs="Times New Roman"/>
+        </w:rPr>
+      </w:pPr>
+      <w:r>
+        <w:rPr>
+          <w:rFonts w:ascii="Times New Roman" w:hAnsi="Times New Roman" w:cs="Times New Roman"/>
+        </w:rPr>
+        <w:t>Record:</w:t>
+      </w:r>
+    </w:p>
+    <w:tbl>
+      <w:tblPr>
+        <w:tblStyle w:val="TableGrid"/>
+        <w:tblW w:w="0" w:type="auto"/>
+        <w:tblLook w:val="04A0" w:firstRow="1" w:lastRow="0" w:firstColumn="1" w:lastColumn="0" w:noHBand="0" w:noVBand="1"/>
+      </w:tblPr>
+      <w:tblGrid>
+        <w:gridCol w:w="985"/>
+        <w:gridCol w:w="3240"/>
+        <w:gridCol w:w="720"/>
+        <w:gridCol w:w="1350"/>
+      </w:tblGrid>
+      <w:tr>
+        <w:tc>
+          <w:tcPr>
+            <w:tcW w:w="985" w:type="dxa"/>
+          </w:tcPr>
+          <w:p>
+            <w:pPr>
+              <w:rPr>
+                <w:rFonts w:ascii="Times New Roman" w:hAnsi="Times New Roman" w:cs="Times New Roman"/>
+              </w:rPr>
+            </w:pPr>
+            <w:r>
+              <w:rPr>
+                <w:rFonts w:ascii="Times New Roman" w:hAnsi="Times New Roman" w:cs="Times New Roman"/>
+              </w:rPr>
+              <w:t>ID (pk)</w:t>
+            </w:r>
+          </w:p>
+        </w:tc>
+        <w:tc>
+          <w:tcPr>
+            <w:tcW w:w="3240" w:type="dxa"/>
+          </w:tcPr>
+          <w:p>
+            <w:pPr>
+              <w:rPr>
+                <w:rFonts w:ascii="Times New Roman" w:hAnsi="Times New Roman" w:cs="Times New Roman"/>
+              </w:rPr>
+            </w:pPr>
+            <w:r>
+              <w:rPr>
+                <w:rFonts w:ascii="Times New Roman" w:hAnsi="Times New Roman" w:cs="Times New Roman"/>
+              </w:rPr>
+              <w:t>Employee (</w:t>
+            </w:r>
+            <w:proofErr w:type="spellStart"/>
+            <w:r>
+              <w:rPr>
+                <w:rFonts w:ascii="Times New Roman" w:hAnsi="Times New Roman" w:cs="Times New Roman"/>
+              </w:rPr>
+              <w:t>fk</w:t>
+            </w:r>
+            <w:proofErr w:type="spellEnd"/>
+            <w:r>
+              <w:rPr>
+                <w:rFonts w:ascii="Times New Roman" w:hAnsi="Times New Roman" w:cs="Times New Roman"/>
+              </w:rPr>
+              <w:t xml:space="preserve"> to Emplyee.ID)</w:t>
+            </w:r>
+          </w:p>
+        </w:tc>
+        <w:tc>
+          <w:tcPr>
+            <w:tcW w:w="720" w:type="dxa"/>
+          </w:tcPr>
+          <w:p>
+            <w:pPr>
+              <w:rPr>
+                <w:rFonts w:ascii="Times New Roman" w:hAnsi="Times New Roman" w:cs="Times New Roman"/>
+              </w:rPr>
+            </w:pPr>
+            <w:r>
+              <w:rPr>
+                <w:rFonts w:ascii="Times New Roman" w:hAnsi="Times New Roman" w:cs="Times New Roman"/>
+              </w:rPr>
+              <w:t>Time</w:t>
+            </w:r>
+          </w:p>
+        </w:tc>
+        <w:tc>
+          <w:tcPr>
+            <w:tcW w:w="1350" w:type="dxa"/>
+          </w:tcPr>
+          <w:p>
+            <w:pPr>
+              <w:rPr>
+                <w:rFonts w:ascii="Times New Roman" w:hAnsi="Times New Roman" w:cs="Times New Roman"/>
+              </w:rPr>
+            </w:pPr>
+            <w:proofErr w:type="spellStart"/>
+            <w:r>
+              <w:rPr>
+                <w:rFonts w:ascii="Times New Roman" w:hAnsi="Times New Roman" w:cs="Times New Roman"/>
+              </w:rPr>
+              <w:t>ActionType</w:t>
+            </w:r>
+            <w:proofErr w:type="spellEnd"/>
+          </w:p>
+        </w:tc>
+      </w:tr>
+    </w:tbl>
+    <w:p>
+      <w:pPr>
+        <w:rPr>
+          <w:rFonts w:ascii="Times New Roman" w:hAnsi="Times New Roman" w:cs="Times New Roman"/>
+        </w:rPr>
+      </w:pPr>
+    </w:p>
+    <w:p>
+      <w:pPr>
+        <w:rPr>
+          <w:rFonts w:ascii="Times New Roman" w:hAnsi="Times New Roman" w:cs="Times New Roman"/>
+        </w:rPr>
+      </w:pPr>
+      <w:r>
+        <w:rPr>
+          <w:rFonts w:ascii="Times New Roman" w:hAnsi="Times New Roman" w:cs="Times New Roman"/>
+        </w:rPr>
+        <w:t>Employee:</w:t>
+      </w:r>
+    </w:p>
+    <w:tbl>
+      <w:tblPr>
+        <w:tblStyle w:val="TableGrid"/>
+        <w:tblW w:w="0" w:type="auto"/>
+        <w:tblLook w:val="04A0" w:firstRow="1" w:lastRow="0" w:firstColumn="1" w:lastColumn="0" w:noHBand="0" w:noVBand="1"/>
+      </w:tblPr>
+      <w:tblGrid>
+        <w:gridCol w:w="1074"/>
+        <w:gridCol w:w="1189"/>
+        <w:gridCol w:w="1152"/>
+        <w:gridCol w:w="590"/>
+      </w:tblGrid>
+      <w:tr>
+        <w:tc>
+          <w:tcPr>
+            <w:tcW w:w="1074" w:type="dxa"/>
+          </w:tcPr>
+          <w:p>
+            <w:pPr>
+              <w:rPr>
+                <w:rFonts w:ascii="Times New Roman" w:hAnsi="Times New Roman" w:cs="Times New Roman"/>
+              </w:rPr>
+            </w:pPr>
+            <w:r>
+              <w:rPr>
+                <w:rFonts w:ascii="Times New Roman" w:hAnsi="Times New Roman" w:cs="Times New Roman"/>
+              </w:rPr>
+              <w:t>ID (pk)</w:t>
+            </w:r>
+          </w:p>
+        </w:tc>
+        <w:tc>
+          <w:tcPr>
+            <w:tcW w:w="1189" w:type="dxa"/>
+          </w:tcPr>
+          <w:p>
+            <w:pPr>
+              <w:rPr>
+                <w:rFonts w:ascii="Times New Roman" w:hAnsi="Times New Roman" w:cs="Times New Roman"/>
+              </w:rPr>
+            </w:pPr>
+            <w:r>
+              <w:rPr>
+                <w:rFonts w:ascii="Times New Roman" w:hAnsi="Times New Roman" w:cs="Times New Roman"/>
+              </w:rPr>
+              <w:t>Username</w:t>
+            </w:r>
+          </w:p>
+        </w:tc>
+        <w:tc>
+          <w:tcPr>
+            <w:tcW w:w="1152" w:type="dxa"/>
+          </w:tcPr>
+          <w:p>
+            <w:pPr>
+              <w:rPr>
+                <w:rFonts w:ascii="Times New Roman" w:hAnsi="Times New Roman" w:cs="Times New Roman"/>
+              </w:rPr>
+            </w:pPr>
+            <w:r>
+              <w:rPr>
+                <w:rFonts w:ascii="Times New Roman" w:hAnsi="Times New Roman" w:cs="Times New Roman"/>
+              </w:rPr>
+              <w:t>Password</w:t>
+            </w:r>
+          </w:p>
+        </w:tc>
+        <w:tc>
+          <w:tcPr>
+            <w:tcW w:w="584" w:type="dxa"/>
+          </w:tcPr>
+          <w:p>
+            <w:pPr>
+              <w:rPr>
+                <w:rFonts w:ascii="Times New Roman" w:hAnsi="Times New Roman" w:cs="Times New Roman"/>
+              </w:rPr>
+            </w:pPr>
+            <w:r>
+              <w:rPr>
+                <w:rFonts w:ascii="Times New Roman" w:hAnsi="Times New Roman" w:cs="Times New Roman"/>
+              </w:rPr>
+              <w:t>Salt</w:t>
+            </w:r>
+          </w:p>
+        </w:tc>
+      </w:tr>
+    </w:tbl>
+    <w:p>
+      <w:pPr>
+        <w:rPr>
+          <w:rFonts w:ascii="Times New Roman" w:hAnsi="Times New Roman" w:cs="Times New Roman"/>
+        </w:rPr>
+      </w:pPr>
+    </w:p>
+    <w:p>
+      <w:pPr>
+        <w:rPr>
+          <w:rFonts w:ascii="Times New Roman" w:hAnsi="Times New Roman" w:cs="Times New Roman"/>
+        </w:rPr>
+      </w:pPr>
+      <w:r>
+        <w:rPr>
+          <w:rFonts w:ascii="Times New Roman" w:hAnsi="Times New Roman" w:cs="Times New Roman"/>
+        </w:rPr>
+        <w:t>Make:</w:t>
+      </w:r>
+    </w:p>
+    <w:tbl>
+      <w:tblPr>
+        <w:tblStyle w:val="TableGrid"/>
+        <w:tblW w:w="0" w:type="auto"/>
+        <w:tblLook w:val="04A0" w:firstRow="1" w:lastRow="0" w:firstColumn="1" w:lastColumn="0" w:noHBand="0" w:noVBand="1"/>
+      </w:tblPr>
+      <w:tblGrid>
+        <w:gridCol w:w="1075"/>
+        <w:gridCol w:w="810"/>
+      </w:tblGrid>
+      <w:tr>
+        <w:tc>
+          <w:tcPr>
+            <w:tcW w:w="1075" w:type="dxa"/>
+          </w:tcPr>
+          <w:p>
+            <w:pPr>
+              <w:rPr>
+                <w:rFonts w:ascii="Times New Roman" w:hAnsi="Times New Roman" w:cs="Times New Roman"/>
+              </w:rPr>
+            </w:pPr>
+            <w:r>
+              <w:rPr>
+                <w:rFonts w:ascii="Times New Roman" w:hAnsi="Times New Roman" w:cs="Times New Roman"/>
+              </w:rPr>
+              <w:t>ID (pk)</w:t>
+            </w:r>
+          </w:p>
+        </w:tc>
+        <w:tc>
+          <w:tcPr>
+            <w:tcW w:w="810" w:type="dxa"/>
+          </w:tcPr>
+          <w:p>
+            <w:pPr>
+              <w:rPr>
+                <w:rFonts w:ascii="Times New Roman" w:hAnsi="Times New Roman" w:cs="Times New Roman"/>
+              </w:rPr>
+            </w:pPr>
+            <w:r>
+              <w:rPr>
+                <w:rFonts w:ascii="Times New Roman" w:hAnsi="Times New Roman" w:cs="Times New Roman"/>
+              </w:rPr>
+              <w:t>Name</w:t>
+            </w:r>
+          </w:p>
+        </w:tc>
+      </w:tr>
+    </w:tbl>
+    <w:p>
+      <w:pPr>
+        <w:rPr>
+          <w:rFonts w:ascii="Times New Roman" w:hAnsi="Times New Roman" w:cs="Times New Roman"/>
+        </w:rPr>
+      </w:pPr>
+    </w:p>
+    <w:p>
+      <w:pPr>
+        <w:rPr>
+          <w:rFonts w:ascii="Times New Roman" w:hAnsi="Times New Roman" w:cs="Times New Roman"/>
+        </w:rPr>
+      </w:pPr>
+      <w:r>
+        <w:rPr>
+          <w:rFonts w:ascii="Times New Roman" w:hAnsi="Times New Roman" w:cs="Times New Roman"/>
+        </w:rPr>
+        <w:t>Model:</w:t>
+      </w:r>
+    </w:p>
+    <w:tbl>
+      <w:tblPr>
+        <w:tblStyle w:val="TableGrid"/>
+        <w:tblW w:w="0" w:type="auto"/>
+        <w:tblLook w:val="04A0" w:firstRow="1" w:lastRow="0" w:firstColumn="1" w:lastColumn="0" w:noHBand="0" w:noVBand="1"/>
+      </w:tblPr>
+      <w:tblGrid>
+        <w:gridCol w:w="985"/>
+        <w:gridCol w:w="810"/>
+        <w:gridCol w:w="2520"/>
+      </w:tblGrid>
+      <w:tr>
+        <w:tc>
+          <w:tcPr>
+            <w:tcW w:w="985" w:type="dxa"/>
+          </w:tcPr>
+          <w:p>
+            <w:pPr>
+              <w:rPr>
+                <w:rFonts w:ascii="Times New Roman" w:hAnsi="Times New Roman" w:cs="Times New Roman"/>
+              </w:rPr>
+            </w:pPr>
+            <w:proofErr w:type="gramStart"/>
+            <w:r>
+              <w:rPr>
+                <w:rFonts w:ascii="Times New Roman" w:hAnsi="Times New Roman" w:cs="Times New Roman"/>
+              </w:rPr>
+              <w:t>ID(</w:t>
+            </w:r>
+            <w:proofErr w:type="gramEnd"/>
+            <w:r>
+              <w:rPr>
+                <w:rFonts w:ascii="Times New Roman" w:hAnsi="Times New Roman" w:cs="Times New Roman"/>
+              </w:rPr>
+              <w:t>pk)</w:t>
+            </w:r>
+          </w:p>
+        </w:tc>
+        <w:tc>
+          <w:tcPr>
+            <w:tcW w:w="810" w:type="dxa"/>
+          </w:tcPr>
+          <w:p>
+            <w:pPr>
+              <w:rPr>
+                <w:rFonts w:ascii="Times New Roman" w:hAnsi="Times New Roman" w:cs="Times New Roman"/>
+              </w:rPr>
+            </w:pPr>
+            <w:r>
+              <w:rPr>
+                <w:rFonts w:ascii="Times New Roman" w:hAnsi="Times New Roman" w:cs="Times New Roman"/>
+              </w:rPr>
+              <w:t>Name</w:t>
+            </w:r>
+          </w:p>
+        </w:tc>
+        <w:tc>
+          <w:tcPr>
+            <w:tcW w:w="2520" w:type="dxa"/>
+          </w:tcPr>
+          <w:p>
+            <w:pPr>
+              <w:rPr>
+                <w:rFonts w:ascii="Times New Roman" w:hAnsi="Times New Roman" w:cs="Times New Roman"/>
+              </w:rPr>
+            </w:pPr>
+            <w:r>
+              <w:rPr>
+                <w:rFonts w:ascii="Times New Roman" w:hAnsi="Times New Roman" w:cs="Times New Roman"/>
+              </w:rPr>
+              <w:t>Make (</w:t>
+            </w:r>
+            <w:proofErr w:type="spellStart"/>
+            <w:r>
+              <w:rPr>
+                <w:rFonts w:ascii="Times New Roman" w:hAnsi="Times New Roman" w:cs="Times New Roman"/>
+              </w:rPr>
+              <w:t>fk</w:t>
+            </w:r>
+            <w:proofErr w:type="spellEnd"/>
+            <w:r>
+              <w:rPr>
+                <w:rFonts w:ascii="Times New Roman" w:hAnsi="Times New Roman" w:cs="Times New Roman"/>
+              </w:rPr>
+              <w:t xml:space="preserve"> to Make.ID)</w:t>
+            </w:r>
+          </w:p>
+        </w:tc>
+      </w:tr>
+    </w:tbl>
+    <w:p>
+      <w:pPr>
+        <w:rPr>
+          <w:rFonts w:ascii="Times New Roman" w:hAnsi="Times New Roman" w:cs="Times New Roman"/>
+        </w:rPr>
+      </w:pPr>
+    </w:p>
+    <w:p>
+      <w:pPr>
+        <w:rPr>
+          <w:rFonts w:ascii="Times New Roman" w:hAnsi="Times New Roman" w:cs="Times New Roman"/>
+        </w:rPr>
+      </w:pPr>
+      <w:r>
+        <w:rPr>
+          <w:rFonts w:ascii="Times New Roman" w:hAnsi="Times New Roman" w:cs="Times New Roman"/>
+        </w:rPr>
+        <w:t>Car:</w:t>
+      </w:r>
+    </w:p>
+    <w:tbl>
+      <w:tblPr>
+        <w:tblStyle w:val="TableGrid"/>
+        <w:tblW w:w="0" w:type="auto"/>
+        <w:tblLook w:val="04A0" w:firstRow="1" w:lastRow="0" w:firstColumn="1" w:lastColumn="0" w:noHBand="0" w:noVBand="1"/>
+      </w:tblPr>
+      <w:tblGrid>
+        <w:gridCol w:w="1016"/>
+        <w:gridCol w:w="779"/>
+        <w:gridCol w:w="1620"/>
+        <w:gridCol w:w="2520"/>
+        <w:gridCol w:w="1080"/>
+      </w:tblGrid>
+      <w:tr>
+        <w:tc>
+          <w:tcPr>
+            <w:tcW w:w="1016" w:type="dxa"/>
+          </w:tcPr>
+          <w:p>
+            <w:pPr>
+              <w:rPr>
+                <w:rFonts w:ascii="Times New Roman" w:hAnsi="Times New Roman" w:cs="Times New Roman"/>
+              </w:rPr>
+            </w:pPr>
+            <w:proofErr w:type="gramStart"/>
+            <w:r>
+              <w:rPr>
+                <w:rFonts w:ascii="Times New Roman" w:hAnsi="Times New Roman" w:cs="Times New Roman"/>
+              </w:rPr>
+              <w:t>ID(</w:t>
+            </w:r>
+            <w:proofErr w:type="gramEnd"/>
+            <w:r>
+              <w:rPr>
+                <w:rFonts w:ascii="Times New Roman" w:hAnsi="Times New Roman" w:cs="Times New Roman"/>
+              </w:rPr>
+              <w:t>pk)</w:t>
+            </w:r>
+          </w:p>
+        </w:tc>
+        <w:tc>
+          <w:tcPr>
+            <w:tcW w:w="779" w:type="dxa"/>
+          </w:tcPr>
+          <w:p>
+            <w:pPr>
+              <w:rPr>
+                <w:rFonts w:ascii="Times New Roman" w:hAnsi="Times New Roman" w:cs="Times New Roman"/>
+              </w:rPr>
+            </w:pPr>
+            <w:r>
+              <w:rPr>
+                <w:rFonts w:ascii="Times New Roman" w:hAnsi="Times New Roman" w:cs="Times New Roman"/>
+              </w:rPr>
+              <w:t>Color</w:t>
+            </w:r>
+          </w:p>
+        </w:tc>
+        <w:tc>
+          <w:tcPr>
+            <w:tcW w:w="1620" w:type="dxa"/>
+          </w:tcPr>
+          <w:p>
+            <w:pPr>
+              <w:rPr>
+                <w:rFonts w:ascii="Times New Roman" w:hAnsi="Times New Roman" w:cs="Times New Roman"/>
+              </w:rPr>
+            </w:pPr>
+            <w:r>
+              <w:rPr>
+                <w:rFonts w:ascii="Times New Roman" w:hAnsi="Times New Roman" w:cs="Times New Roman"/>
+              </w:rPr>
+              <w:t>Year</w:t>
+            </w:r>
+          </w:p>
+        </w:tc>
+        <w:tc>
+          <w:tcPr>
+            <w:tcW w:w="2520" w:type="dxa"/>
+          </w:tcPr>
+          <w:p>
+            <w:pPr>
+              <w:rPr>
+                <w:rFonts w:ascii="Times New Roman" w:hAnsi="Times New Roman" w:cs="Times New Roman"/>
+              </w:rPr>
+            </w:pPr>
+            <w:r>
+              <w:rPr>
+                <w:rFonts w:ascii="Times New Roman" w:hAnsi="Times New Roman" w:cs="Times New Roman"/>
+              </w:rPr>
+              <w:t>Make (</w:t>
+            </w:r>
+            <w:proofErr w:type="spellStart"/>
+            <w:r>
+              <w:rPr>
+                <w:rFonts w:ascii="Times New Roman" w:hAnsi="Times New Roman" w:cs="Times New Roman"/>
+              </w:rPr>
+              <w:t>fk</w:t>
+            </w:r>
+            <w:proofErr w:type="spellEnd"/>
+            <w:r>
+              <w:rPr>
+                <w:rFonts w:ascii="Times New Roman" w:hAnsi="Times New Roman" w:cs="Times New Roman"/>
+              </w:rPr>
+              <w:t xml:space="preserve"> to Make.ID)</w:t>
+            </w:r>
+          </w:p>
+        </w:tc>
+        <w:tc>
+          <w:tcPr>
+            <w:tcW w:w="1080" w:type="dxa"/>
+          </w:tcPr>
+          <w:p>
+            <w:pPr>
+              <w:rPr>
+                <w:rFonts w:ascii="Times New Roman" w:hAnsi="Times New Roman" w:cs="Times New Roman"/>
+              </w:rPr>
+            </w:pPr>
+            <w:r>
+              <w:rPr>
+                <w:rFonts w:ascii="Times New Roman" w:hAnsi="Times New Roman" w:cs="Times New Roman"/>
+              </w:rPr>
+              <w:t>Value</w:t>
+            </w:r>
+          </w:p>
+        </w:tc>
+      </w:tr>
+      <w:tr>
+        <w:tc>
+          <w:tcPr>
+            <w:tcW w:w="1016" w:type="dxa"/>
+          </w:tcPr>
+          <w:p>
+            <w:pPr>
+              <w:rPr>
+                <w:rFonts w:ascii="Times New Roman" w:hAnsi="Times New Roman" w:cs="Times New Roman"/>
+              </w:rPr>
+            </w:pPr>
+            <w:proofErr w:type="spellStart"/>
+            <w:r>
+              <w:rPr>
+                <w:rFonts w:ascii="Times New Roman" w:hAnsi="Times New Roman" w:cs="Times New Roman"/>
+              </w:rPr>
+              <w:t>LicPlate</w:t>
+            </w:r>
+            <w:proofErr w:type="spellEnd"/>
+          </w:p>
+        </w:tc>
+        <w:tc>
+          <w:tcPr>
+            <w:tcW w:w="779" w:type="dxa"/>
+          </w:tcPr>
+          <w:p>
+            <w:pPr>
+              <w:rPr>
+                <w:rFonts w:ascii="Times New Roman" w:hAnsi="Times New Roman" w:cs="Times New Roman"/>
+              </w:rPr>
+            </w:pPr>
+            <w:r>
+              <w:rPr>
+                <w:rFonts w:ascii="Times New Roman" w:hAnsi="Times New Roman" w:cs="Times New Roman"/>
+              </w:rPr>
+              <w:t>VIN</w:t>
+            </w:r>
+          </w:p>
+        </w:tc>
+        <w:tc>
+          <w:tcPr>
+            <w:tcW w:w="1620" w:type="dxa"/>
+          </w:tcPr>
+          <w:p>
+            <w:pPr>
+              <w:rPr>
+                <w:rFonts w:ascii="Times New Roman" w:hAnsi="Times New Roman" w:cs="Times New Roman"/>
+              </w:rPr>
+            </w:pPr>
+            <w:proofErr w:type="spellStart"/>
+            <w:r>
+              <w:rPr>
+                <w:rFonts w:ascii="Times New Roman" w:hAnsi="Times New Roman" w:cs="Times New Roman"/>
+              </w:rPr>
+              <w:t>Miles_PerGal</w:t>
+            </w:r>
+            <w:proofErr w:type="spellEnd"/>
+          </w:p>
+        </w:tc>
+        <w:tc>
+          <w:tcPr>
+            <w:tcW w:w="2520" w:type="dxa"/>
+          </w:tcPr>
+          <w:p>
+            <w:pPr>
+              <w:rPr>
+                <w:rFonts w:ascii="Times New Roman" w:hAnsi="Times New Roman" w:cs="Times New Roman"/>
+              </w:rPr>
+            </w:pPr>
+            <w:r>
+              <w:rPr>
+                <w:rFonts w:ascii="Times New Roman" w:hAnsi="Times New Roman" w:cs="Times New Roman"/>
+              </w:rPr>
+              <w:t>Model (</w:t>
+            </w:r>
+            <w:proofErr w:type="spellStart"/>
+            <w:r>
+              <w:rPr>
+                <w:rFonts w:ascii="Times New Roman" w:hAnsi="Times New Roman" w:cs="Times New Roman"/>
+              </w:rPr>
+              <w:t>fk</w:t>
+            </w:r>
+            <w:proofErr w:type="spellEnd"/>
+            <w:r>
+              <w:rPr>
+                <w:rFonts w:ascii="Times New Roman" w:hAnsi="Times New Roman" w:cs="Times New Roman"/>
+              </w:rPr>
+              <w:t xml:space="preserve"> to Model.ID)</w:t>
+            </w:r>
+          </w:p>
+        </w:tc>
+        <w:tc>
+          <w:tcPr>
+            <w:tcW w:w="1080" w:type="dxa"/>
+          </w:tcPr>
+          <w:p>
+            <w:pPr>
+              <w:rPr>
+                <w:rFonts w:ascii="Times New Roman" w:hAnsi="Times New Roman" w:cs="Times New Roman"/>
+              </w:rPr>
+            </w:pPr>
+            <w:r>
+              <w:rPr>
+                <w:rFonts w:ascii="Times New Roman" w:hAnsi="Times New Roman" w:cs="Times New Roman"/>
+              </w:rPr>
+              <w:t>Mileage</w:t>
+            </w:r>
+          </w:p>
+        </w:tc>
+      </w:tr>
+    </w:tbl>
+    <w:p>
+      <w:pPr>
+        <w:rPr>
+          <w:rFonts w:ascii="Times New Roman" w:hAnsi="Times New Roman" w:cs="Times New Roman"/>
+        </w:rPr>
+      </w:pPr>
+    </w:p>
+    <w:p>
+      <w:pPr>
+        <w:rPr>
+          <w:rFonts w:ascii="Times New Roman" w:hAnsi="Times New Roman" w:cs="Times New Roman"/>
+        </w:rPr>
+      </w:pPr>
+      <w:r>
+        <w:rPr>
+          <w:rFonts w:ascii="Times New Roman" w:hAnsi="Times New Roman" w:cs="Times New Roman"/>
+        </w:rPr>
+        <w:t>The ER-Diagram of the database is as follows:</w:t>
+      </w:r>
+    </w:p>
+    <w:p>
+      <w:pPr>
+        <w:rPr>
+          <w:rFonts w:ascii="Times New Roman" w:hAnsi="Times New Roman" w:cs="Times New Roman"/>
+        </w:rPr>
+      </w:pPr>
+      <w:r>
+        <w:rPr>
+          <w:rFonts w:ascii="Times New Roman" w:hAnsi="Times New Roman" w:cs="Times New Roman"/>
+          <w:noProof/>
+        </w:rPr>
+        <w:drawing>
+          <wp:inline distT="0" distB="0" distL="0" distR="0" wp14:anchorId="3828BA70" wp14:editId="5853AA18">
+            <wp:extent cx="2865120" cy="2855892"/>
+            <wp:effectExtent l="0" t="0" r="0" b="1905"/>
+            <wp:docPr id="636022533" name="Picture 76"/>
+            <wp:cNvGraphicFramePr>
+              <a:graphicFrameLocks xmlns:a="http://schemas.openxmlformats.org/drawingml/2006/main" noChangeAspect="1"/>
+            </wp:cNvGraphicFramePr>
+            <a:graphic xmlns:a="http://schemas.openxmlformats.org/drawingml/2006/main">
+              <a:graphicData uri="http://schemas.openxmlformats.org/drawingml/2006/picture">
+                <pic:pic xmlns:pic="http://schemas.openxmlformats.org/drawingml/2006/picture">
+                  <pic:nvPicPr>
+                    <pic:cNvPr id="0" name="Picture 1"/>
+                    <pic:cNvPicPr>
+                      <a:picLocks noChangeAspect="1" noChangeArrowheads="1"/>
+                    </pic:cNvPicPr>
+                  </pic:nvPicPr>
+                  <pic:blipFill>
+                    <a:blip r:embed="rId7">
+                      <a:extLst>
+                        <a:ext uri="{28A0092B-C50C-407E-A947-70E740481C1C}">
+                          <a14:useLocalDpi xmlns:a14="http://schemas.microsoft.com/office/drawing/2010/main" val="0"/>
+                        </a:ext>
+                      </a:extLst>
+                    </a:blip>
+                    <a:srcRect/>
+                    <a:stretch>
+                      <a:fillRect/>
+                    </a:stretch>
+                  </pic:blipFill>
+                  <pic:spPr bwMode="auto">
+                    <a:xfrm>
+                      <a:off x="0" y="0"/>
+                      <a:ext cx="2877698" cy="2868429"/>
+                    </a:xfrm>
+                    <a:prstGeom prst="rect">
+                      <a:avLst/>
+                    </a:prstGeom>
+                    <a:noFill/>
+                    <a:ln>
+                      <a:noFill/>
+                    </a:ln>
+                  </pic:spPr>
+                </pic:pic>
+              </a:graphicData>
+            </a:graphic>
+          </wp:inline>
+        </w:drawing>
+      </w:r>
+    </w:p>
+    <w:p>
+      <w:pPr>
+        <w:rPr>
+          <w:rFonts w:ascii="Times New Roman" w:hAnsi="Times New Roman" w:cs="Times New Roman"/>
+        </w:rPr>
+      </w:pPr>
+      <w:r>
+        <w:rPr>
+          <w:rFonts w:ascii="Times New Roman" w:hAnsi="Times New Roman" w:cs="Times New Roman"/>
+        </w:rPr>
+        <w:lastRenderedPageBreak/>
+        <w:t>Normalization:</w:t>
+      </w:r>
+    </w:p>
+    <w:p>
+      <w:pPr>
+        <w:rPr>
+          <w:rFonts w:ascii="Times New Roman" w:hAnsi="Times New Roman" w:cs="Times New Roman"/>
+        </w:rPr>
+      </w:pPr>
+      <w:r>
+        <w:rPr>
+          <w:rFonts w:ascii="Times New Roman" w:hAnsi="Times New Roman" w:cs="Times New Roman"/>
+        </w:rPr>
+        <w:tab/>
+      </w:r>
+      <w:r>
+        <w:rPr>
+          <w:rFonts w:ascii="Times New Roman" w:hAnsi="Times New Roman" w:cs="Times New Roman"/>
+        </w:rPr>
+        <w:t xml:space="preserve">For a </w:t>
+      </w:r>
+      <w:r>
+        <w:rPr>
+          <w:rFonts w:ascii="Times New Roman" w:hAnsi="Times New Roman" w:cs="Times New Roman"/>
+        </w:rPr>
+        <w:t xml:space="preserve">database/table to be in 3NF, first it must be in 2NF and have no functional dependence </w:t>
+      </w:r>
+      <w:proofErr w:type="gramStart"/>
+      <w:r>
+        <w:rPr>
+          <w:rFonts w:ascii="Times New Roman" w:hAnsi="Times New Roman" w:cs="Times New Roman"/>
+        </w:rPr>
+        <w:t>in</w:t>
+      </w:r>
+      <w:proofErr w:type="gramEnd"/>
+      <w:r>
+        <w:rPr>
+          <w:rFonts w:ascii="Times New Roman" w:hAnsi="Times New Roman" w:cs="Times New Roman"/>
+        </w:rPr>
+        <w:t xml:space="preserve"> non-key attributes. </w:t>
+      </w:r>
+      <w:r>
+        <w:rPr>
+          <w:rFonts w:ascii="Times New Roman" w:hAnsi="Times New Roman" w:cs="Times New Roman"/>
+        </w:rPr>
+        <w:t xml:space="preserve">Going through the tables of the schema, none of the non-key attributes are repeated in any other table, this means if a car is added/removed/updated then no other table will have an anomaly. This also means that </w:t>
+      </w:r>
+      <w:r>
+        <w:rPr>
+          <w:rFonts w:ascii="Times New Roman" w:hAnsi="Times New Roman" w:cs="Times New Roman"/>
+        </w:rPr>
+        <w:t>a record is added to the record table, excluding the primary key and foreign key, the time and action type are not referenced in any other tables</w:t>
+      </w:r>
+      <w:r>
+        <w:rPr>
+          <w:rFonts w:ascii="Times New Roman" w:hAnsi="Times New Roman" w:cs="Times New Roman"/>
+        </w:rPr>
+        <w:t xml:space="preserve">. The make and model names are not referenced anywhere else since their primary key IDs are used in other tables for </w:t>
+      </w:r>
+      <w:r>
+        <w:rPr>
+          <w:rFonts w:ascii="Times New Roman" w:hAnsi="Times New Roman" w:cs="Times New Roman"/>
+        </w:rPr>
+        <w:t>reference</w:t>
+      </w:r>
+      <w:r>
+        <w:rPr>
+          <w:rFonts w:ascii="Times New Roman" w:hAnsi="Times New Roman" w:cs="Times New Roman"/>
+        </w:rPr>
+        <w:t xml:space="preserve">. </w:t>
+      </w:r>
+      <w:r>
+        <w:rPr>
+          <w:rFonts w:ascii="Times New Roman" w:hAnsi="Times New Roman" w:cs="Times New Roman"/>
+        </w:rPr>
+        <w:t>Lastly,</w:t>
+      </w:r>
+      <w:r>
+        <w:rPr>
+          <w:rFonts w:ascii="Times New Roman" w:hAnsi="Times New Roman" w:cs="Times New Roman"/>
+        </w:rPr>
+        <w:t xml:space="preserve"> that leaves the employee table, the username, password, and salt are not needed in any other table since they are just used to log the user in. The ID is used in the records table just </w:t>
+      </w:r>
+      <w:r>
+        <w:rPr>
+          <w:rFonts w:ascii="Times New Roman" w:hAnsi="Times New Roman" w:cs="Times New Roman"/>
+        </w:rPr>
+        <w:t>as the make and model IDs are used in the car table (and make ID in model table).</w:t>
+      </w:r>
+      <w:r>
+        <w:rPr>
+          <w:rFonts w:ascii="Times New Roman" w:hAnsi="Times New Roman" w:cs="Times New Roman"/>
+        </w:rPr>
+        <w:t xml:space="preserve"> All tables were in 2NF since none of the primary keys are composite (they are just autoincremented integers)</w:t>
+      </w:r>
+      <w:r>
+        <w:rPr>
+          <w:rFonts w:ascii="Times New Roman" w:hAnsi="Times New Roman" w:cs="Times New Roman"/>
+        </w:rPr>
+        <w:t>, and each attribute is associated with one primary key</w:t>
+      </w:r>
+      <w:r>
+        <w:rPr>
+          <w:rFonts w:ascii="Times New Roman" w:hAnsi="Times New Roman" w:cs="Times New Roman"/>
+        </w:rPr>
+        <w:t xml:space="preserve">. </w:t>
+      </w:r>
+    </w:p>
+    <w:p>
+      <w:pPr>
+        <w:rPr>
+          <w:rFonts w:ascii="Times New Roman" w:hAnsi="Times New Roman" w:cs="Times New Roman"/>
+        </w:rPr>
+      </w:pPr>
+    </w:p>
+    <w:p>
+      <w:pPr>
+        <w:rPr>
+          <w:rFonts w:ascii="Times New Roman" w:hAnsi="Times New Roman" w:cs="Times New Roman"/>
+        </w:rPr>
+      </w:pPr>
+    </w:p>
+    <w:p>
+      <w:pPr>
+        <w:rPr>
+          <w:rFonts w:ascii="Times New Roman" w:hAnsi="Times New Roman" w:cs="Times New Roman"/>
+        </w:rPr>
+      </w:pPr>
+    </w:p>
+    <w:p>
+      <w:pPr>
+        <w:rPr>
+          <w:rFonts w:ascii="Times New Roman" w:hAnsi="Times New Roman" w:cs="Times New Roman"/>
+        </w:rPr>
+      </w:pPr>
+    </w:p>
+    <w:p>
+      <w:pPr>
+        <w:rPr>
+          <w:rFonts w:ascii="Times New Roman" w:hAnsi="Times New Roman" w:cs="Times New Roman"/>
+        </w:rPr>
+      </w:pPr>
+    </w:p>
+    <w:p>
+      <w:pPr>
+        <w:rPr>
+          <w:rFonts w:ascii="Times New Roman" w:hAnsi="Times New Roman" w:cs="Times New Roman"/>
+        </w:rPr>
+      </w:pPr>
+    </w:p>
+    <w:p>
+      <w:pPr>
+        <w:rPr>
+          <w:rFonts w:ascii="Times New Roman" w:hAnsi="Times New Roman" w:cs="Times New Roman"/>
+        </w:rPr>
+      </w:pPr>
+    </w:p>
+    <w:p>
+      <w:pPr>
+        <w:rPr>
+          <w:rFonts w:ascii="Times New Roman" w:hAnsi="Times New Roman" w:cs="Times New Roman"/>
+        </w:rPr>
+      </w:pPr>
+    </w:p>
+    <w:p>
+      <w:pPr>
+        <w:rPr>
+          <w:rFonts w:ascii="Times New Roman" w:hAnsi="Times New Roman" w:cs="Times New Roman"/>
+        </w:rPr>
+      </w:pPr>
+    </w:p>
+    <w:p>
+      <w:pPr>
+        <w:rPr>
+          <w:rFonts w:ascii="Times New Roman" w:hAnsi="Times New Roman" w:cs="Times New Roman"/>
+        </w:rPr>
+      </w:pPr>
+    </w:p>
+    <w:p>
+      <w:pPr>
+        <w:rPr>
+          <w:rFonts w:ascii="Times New Roman" w:hAnsi="Times New Roman" w:cs="Times New Roman"/>
+        </w:rPr>
+      </w:pPr>
+    </w:p>
+    <w:p>
+      <w:pPr>
+        <w:rPr>
+          <w:rFonts w:ascii="Times New Roman" w:hAnsi="Times New Roman" w:cs="Times New Roman"/>
+        </w:rPr>
+      </w:pPr>
+    </w:p>
+    <w:p>
+      <w:pPr>
+        <w:rPr>
+          <w:rFonts w:ascii="Times New Roman" w:hAnsi="Times New Roman" w:cs="Times New Roman"/>
+        </w:rPr>
+      </w:pPr>
+    </w:p>
+    <w:p>
+      <w:pPr>
+        <w:rPr>
+          <w:rFonts w:ascii="Times New Roman" w:hAnsi="Times New Roman" w:cs="Times New Roman"/>
+        </w:rPr>
+      </w:pPr>
+    </w:p>
+    <w:p>
+      <w:pPr>
+        <w:rPr>
+          <w:rFonts w:ascii="Times New Roman" w:hAnsi="Times New Roman" w:cs="Times New Roman"/>
+        </w:rPr>
+      </w:pPr>
+    </w:p>
+    <w:p>
+      <w:pPr>
+        <w:rPr>
+          <w:rFonts w:ascii="Times New Roman" w:hAnsi="Times New Roman" w:cs="Times New Roman"/>
+        </w:rPr>
+      </w:pPr>
+    </w:p>
+    <w:p>
+      <w:pPr>
+        <w:rPr>
+          <w:rFonts w:ascii="Times New Roman" w:hAnsi="Times New Roman" w:cs="Times New Roman"/>
+        </w:rPr>
+      </w:pPr>
+    </w:p>
+    <w:p>
+      <w:pPr>
+        <w:rPr>
+          <w:rFonts w:ascii="Times New Roman" w:hAnsi="Times New Roman" w:cs="Times New Roman"/>
+        </w:rPr>
+      </w:pPr>
+    </w:p>
+    <w:p>
+      <w:pPr>
+        <w:jc w:val="center"/>
         <w:rPr>
           <w:rFonts w:ascii="Times New Roman" w:hAnsi="Times New Roman" w:cs="Times New Roman"/>
           <w:b/>
           <w:bCs/>
         </w:rPr>
       </w:pPr>
-    </w:p>
-    <w:p>
-      <w:pPr>
+      <w:r>
         <w:rPr>
           <w:rFonts w:ascii="Times New Roman" w:hAnsi="Times New Roman" w:cs="Times New Roman"/>
           <w:b/>
           <w:bCs/>
         </w:rPr>
+        <w:lastRenderedPageBreak/>
+        <w:t>Implementation</w:t>
+      </w:r>
+    </w:p>
+    <w:p>
+      <w:pPr>
+        <w:ind w:firstLine="720"/>
+        <w:rPr>
+          <w:rFonts w:ascii="Times New Roman" w:hAnsi="Times New Roman" w:cs="Times New Roman"/>
+        </w:rPr>
+      </w:pPr>
+      <w:r>
+        <w:rPr>
+          <w:rFonts w:ascii="Times New Roman" w:hAnsi="Times New Roman" w:cs="Times New Roman"/>
+        </w:rPr>
+        <w:t>The entire implementation was done with the programming language C</w:t>
+      </w:r>
+      <w:r>
+        <w:rPr>
+          <w:rFonts w:ascii="Times New Roman" w:hAnsi="Times New Roman" w:cs="Times New Roman"/>
+        </w:rPr>
+        <w:t xml:space="preserve"> with the DBMS SQLite. This was allowed since there is a folder and module allowing for C-executable programs </w:t>
+      </w:r>
+      <w:r>
+        <w:rPr>
+          <w:rFonts w:ascii="Times New Roman" w:hAnsi="Times New Roman" w:cs="Times New Roman"/>
+        </w:rPr>
+        <w:t>to be</w:t>
+      </w:r>
+      <w:r>
+        <w:rPr>
+          <w:rFonts w:ascii="Times New Roman" w:hAnsi="Times New Roman" w:cs="Times New Roman"/>
+        </w:rPr>
+        <w:t xml:space="preserve"> executed when the </w:t>
+      </w:r>
+      <w:r>
+        <w:rPr>
+          <w:rFonts w:ascii="Times New Roman" w:hAnsi="Times New Roman" w:cs="Times New Roman"/>
+        </w:rPr>
+        <w:t>local host</w:t>
+      </w:r>
+      <w:r>
+        <w:rPr>
+          <w:rFonts w:ascii="Times New Roman" w:hAnsi="Times New Roman" w:cs="Times New Roman"/>
+        </w:rPr>
+        <w:t xml:space="preserve"> is called via that </w:t>
+      </w:r>
+      <w:r>
+        <w:rPr>
+          <w:rFonts w:ascii="Times New Roman" w:hAnsi="Times New Roman" w:cs="Times New Roman"/>
+        </w:rPr>
+        <w:t xml:space="preserve">program’s path. The biggest challenges </w:t>
+      </w:r>
+      <w:proofErr w:type="gramStart"/>
+      <w:r>
+        <w:rPr>
+          <w:rFonts w:ascii="Times New Roman" w:hAnsi="Times New Roman" w:cs="Times New Roman"/>
+        </w:rPr>
+        <w:t>was</w:t>
+      </w:r>
+      <w:proofErr w:type="gramEnd"/>
+      <w:r>
+        <w:rPr>
+          <w:rFonts w:ascii="Times New Roman" w:hAnsi="Times New Roman" w:cs="Times New Roman"/>
+        </w:rPr>
+        <w:t xml:space="preserve"> ensuring the </w:t>
+      </w:r>
+      <w:r>
+        <w:rPr>
+          <w:rFonts w:ascii="Times New Roman" w:hAnsi="Times New Roman" w:cs="Times New Roman"/>
+        </w:rPr>
+        <w:t>html printed the same way through the project since both GET and POST were used to make page transitions correctly.</w:t>
+      </w:r>
+    </w:p>
+    <w:p>
+      <w:pPr>
+        <w:ind w:firstLine="720"/>
+        <w:rPr>
+          <w:rFonts w:ascii="Times New Roman" w:hAnsi="Times New Roman" w:cs="Times New Roman"/>
+        </w:rPr>
+      </w:pPr>
+      <w:r>
+        <w:rPr>
+          <w:rFonts w:ascii="Times New Roman" w:hAnsi="Times New Roman" w:cs="Times New Roman"/>
+        </w:rPr>
+        <w:t xml:space="preserve">The database connection function </w:t>
+      </w:r>
+      <w:r>
+        <w:rPr>
+          <w:rFonts w:ascii="Times New Roman" w:hAnsi="Times New Roman" w:cs="Times New Roman"/>
+        </w:rPr>
+        <w:t>was reused in every case of a query being executed, this function simply creates the connection object, executes to create the tables (if not exists</w:t>
+      </w:r>
+      <w:r>
+        <w:rPr>
+          <w:rFonts w:ascii="Times New Roman" w:hAnsi="Times New Roman" w:cs="Times New Roman"/>
+        </w:rPr>
+        <w:t>), and returned said connection object. Here’s a snippet of what the connection function look</w:t>
+      </w:r>
+      <w:r>
+        <w:rPr>
+          <w:rFonts w:ascii="Times New Roman" w:hAnsi="Times New Roman" w:cs="Times New Roman"/>
+        </w:rPr>
+        <w:t>s</w:t>
+      </w:r>
+      <w:r>
+        <w:rPr>
+          <w:rFonts w:ascii="Times New Roman" w:hAnsi="Times New Roman" w:cs="Times New Roman"/>
+        </w:rPr>
+        <w:t xml:space="preserve"> like: </w:t>
+      </w:r>
+    </w:p>
+    <w:p>
+      <w:pPr>
+        <w:rPr>
+          <w:rFonts w:ascii="Times New Roman" w:hAnsi="Times New Roman" w:cs="Times New Roman"/>
+        </w:rPr>
+      </w:pPr>
+      <w:r>
+        <w:rPr>
+          <w:rFonts w:ascii="Times New Roman" w:hAnsi="Times New Roman" w:cs="Times New Roman"/>
+          <w:noProof/>
+        </w:rPr>
+        <w:drawing>
+          <wp:inline distT="0" distB="0" distL="0" distR="0" wp14:anchorId="46D95425" wp14:editId="7AA54002">
+            <wp:extent cx="3941298" cy="2499360"/>
+            <wp:effectExtent l="0" t="0" r="2540" b="0"/>
+            <wp:docPr id="287137109" name="Picture 77" descr="A screenshot of a computer code&#10;&#10;AI-generated content may be incorrect."/>
+            <wp:cNvGraphicFramePr>
+              <a:graphicFrameLocks xmlns:a="http://schemas.openxmlformats.org/drawingml/2006/main" noChangeAspect="1"/>
+            </wp:cNvGraphicFramePr>
+            <a:graphic xmlns:a="http://schemas.openxmlformats.org/drawingml/2006/main">
+              <a:graphicData uri="http://schemas.openxmlformats.org/drawingml/2006/picture">
+                <pic:pic xmlns:pic="http://schemas.openxmlformats.org/drawingml/2006/picture">
+                  <pic:nvPicPr>
+                    <pic:cNvPr id="287137109" name="Picture 77" descr="A screenshot of a computer code&#10;&#10;AI-generated content may be incorrect."/>
+                    <pic:cNvPicPr>
+                      <a:picLocks noChangeAspect="1" noChangeArrowheads="1"/>
+                    </pic:cNvPicPr>
+                  </pic:nvPicPr>
+                  <pic:blipFill>
+                    <a:blip r:embed="rId8" cstate="print">
+                      <a:extLst>
+                        <a:ext uri="{28A0092B-C50C-407E-A947-70E740481C1C}">
+                          <a14:useLocalDpi xmlns:a14="http://schemas.microsoft.com/office/drawing/2010/main" val="0"/>
+                        </a:ext>
+                      </a:extLst>
+                    </a:blip>
+                    <a:srcRect/>
+                    <a:stretch>
+                      <a:fillRect/>
+                    </a:stretch>
+                  </pic:blipFill>
+                  <pic:spPr bwMode="auto">
+                    <a:xfrm>
+                      <a:off x="0" y="0"/>
+                      <a:ext cx="3949683" cy="2504677"/>
+                    </a:xfrm>
+                    <a:prstGeom prst="rect">
+                      <a:avLst/>
+                    </a:prstGeom>
+                    <a:noFill/>
+                    <a:ln>
+                      <a:noFill/>
+                    </a:ln>
+                    <a:effectLst>
+                      <a:softEdge rad="0"/>
+                    </a:effectLst>
+                  </pic:spPr>
+                </pic:pic>
+              </a:graphicData>
+            </a:graphic>
+          </wp:inline>
+        </w:drawing>
+      </w:r>
+    </w:p>
+    <w:p>
+      <w:pPr>
+        <w:rPr>
+          <w:rFonts w:ascii="Times New Roman" w:hAnsi="Times New Roman" w:cs="Times New Roman"/>
+        </w:rPr>
+      </w:pPr>
+    </w:p>
+    <w:p>
+      <w:pPr>
+        <w:rPr>
+          <w:rFonts w:ascii="Times New Roman" w:hAnsi="Times New Roman" w:cs="Times New Roman"/>
+        </w:rPr>
+      </w:pPr>
+      <w:r>
+        <w:rPr>
+          <w:rFonts w:ascii="Times New Roman" w:hAnsi="Times New Roman" w:cs="Times New Roman"/>
+        </w:rPr>
+        <w:tab/>
+      </w:r>
+      <w:r>
+        <w:rPr>
+          <w:rFonts w:ascii="Times New Roman" w:hAnsi="Times New Roman" w:cs="Times New Roman"/>
+        </w:rPr>
+        <w:t xml:space="preserve">The records table (which is not accessible through the website by design) is added to via a function which is called only when a car is added to, deleted from, or updated in the database. </w:t>
+      </w:r>
+      <w:r>
+        <w:rPr>
+          <w:rFonts w:ascii="Times New Roman" w:hAnsi="Times New Roman" w:cs="Times New Roman"/>
+        </w:rPr>
+        <w:t>Here’s a snippet of what the insert record function looks like:</w:t>
+      </w:r>
+    </w:p>
+    <w:p>
+      <w:pPr>
+        <w:rPr>
+          <w:rFonts w:ascii="Times New Roman" w:hAnsi="Times New Roman" w:cs="Times New Roman"/>
+        </w:rPr>
+      </w:pPr>
+      <w:r>
+        <w:rPr>
+          <w:rFonts w:ascii="Times New Roman" w:hAnsi="Times New Roman" w:cs="Times New Roman"/>
+          <w:noProof/>
+        </w:rPr>
+        <w:drawing>
+          <wp:inline distT="0" distB="0" distL="0" distR="0" wp14:anchorId="6DFD6EED" wp14:editId="0521E44B">
+            <wp:extent cx="4004781" cy="1920240"/>
+            <wp:effectExtent l="0" t="0" r="0" b="3810"/>
+            <wp:docPr id="1879127119" name="Picture 78"/>
+            <wp:cNvGraphicFramePr>
+              <a:graphicFrameLocks xmlns:a="http://schemas.openxmlformats.org/drawingml/2006/main" noChangeAspect="1"/>
+            </wp:cNvGraphicFramePr>
+            <a:graphic xmlns:a="http://schemas.openxmlformats.org/drawingml/2006/main">
+              <a:graphicData uri="http://schemas.openxmlformats.org/drawingml/2006/picture">
+                <pic:pic xmlns:pic="http://schemas.openxmlformats.org/drawingml/2006/picture">
+                  <pic:nvPicPr>
+                    <pic:cNvPr id="0" name="Picture 3"/>
+                    <pic:cNvPicPr>
+                      <a:picLocks noChangeAspect="1" noChangeArrowheads="1"/>
+                    </pic:cNvPicPr>
+                  </pic:nvPicPr>
+                  <pic:blipFill>
+                    <a:blip r:embed="rId9" cstate="print">
+                      <a:extLst>
+                        <a:ext uri="{28A0092B-C50C-407E-A947-70E740481C1C}">
+                          <a14:useLocalDpi xmlns:a14="http://schemas.microsoft.com/office/drawing/2010/main" val="0"/>
+                        </a:ext>
+                      </a:extLst>
+                    </a:blip>
+                    <a:srcRect/>
+                    <a:stretch>
+                      <a:fillRect/>
+                    </a:stretch>
+                  </pic:blipFill>
+                  <pic:spPr bwMode="auto">
+                    <a:xfrm>
+                      <a:off x="0" y="0"/>
+                      <a:ext cx="4022805" cy="1928882"/>
+                    </a:xfrm>
+                    <a:prstGeom prst="rect">
+                      <a:avLst/>
+                    </a:prstGeom>
+                    <a:noFill/>
+                    <a:ln>
+                      <a:noFill/>
+                    </a:ln>
+                  </pic:spPr>
+                </pic:pic>
+              </a:graphicData>
+            </a:graphic>
+          </wp:inline>
+        </w:drawing>
+      </w:r>
+    </w:p>
+    <w:p>
+      <w:pPr>
+        <w:rPr>
+          <w:rFonts w:ascii="Times New Roman" w:hAnsi="Times New Roman" w:cs="Times New Roman"/>
+        </w:rPr>
+      </w:pPr>
+    </w:p>
+    <w:p>
+      <w:pPr>
+        <w:rPr>
+          <w:rFonts w:ascii="Times New Roman" w:hAnsi="Times New Roman" w:cs="Times New Roman"/>
+        </w:rPr>
+      </w:pPr>
+      <w:r>
+        <w:rPr>
+          <w:rFonts w:ascii="Times New Roman" w:hAnsi="Times New Roman" w:cs="Times New Roman"/>
+        </w:rPr>
+        <w:lastRenderedPageBreak/>
+        <w:tab/>
+        <w:t>The rest of the main function of the program is split into two segments, the GET and POST handlers. Starting with the GET, the function for the ‘listing’ protocols is to simply print the html header and needed forms (</w:t>
+      </w:r>
+      <w:r>
+        <w:rPr>
+          <w:rFonts w:ascii="Times New Roman" w:hAnsi="Times New Roman" w:cs="Times New Roman"/>
+        </w:rPr>
+        <w:t xml:space="preserve">and populate where applicable, more on that later). There is another case in the GET segment </w:t>
+      </w:r>
+      <w:r>
+        <w:rPr>
+          <w:rFonts w:ascii="Times New Roman" w:hAnsi="Times New Roman" w:cs="Times New Roman"/>
+        </w:rPr>
+        <w:t>(update cars) where the page must pass the information to switch from the update selection (select a car to update) to update main (update that car)</w:t>
+      </w:r>
+      <w:r>
+        <w:rPr>
+          <w:rFonts w:ascii="Times New Roman" w:hAnsi="Times New Roman" w:cs="Times New Roman"/>
+        </w:rPr>
+        <w:t>. The information being passed includes the car ID and employee ID (which is also passed from the employee login page to the add car, remove car, and update car</w:t>
+      </w:r>
+      <w:r>
+        <w:rPr>
+          <w:rFonts w:ascii="Times New Roman" w:hAnsi="Times New Roman" w:cs="Times New Roman"/>
+        </w:rPr>
+        <w:t xml:space="preserve"> pages (add and remove through POST). Here’s two examples of the GET segment (first </w:t>
+      </w:r>
+      <w:r>
+        <w:rPr>
+          <w:rFonts w:ascii="Times New Roman" w:hAnsi="Times New Roman" w:cs="Times New Roman"/>
+        </w:rPr>
+        <w:t>two are</w:t>
+      </w:r>
+      <w:r>
+        <w:rPr>
+          <w:rFonts w:ascii="Times New Roman" w:hAnsi="Times New Roman" w:cs="Times New Roman"/>
+        </w:rPr>
+        <w:t xml:space="preserve"> a listing the </w:t>
+      </w:r>
+      <w:r>
+        <w:rPr>
+          <w:rFonts w:ascii="Times New Roman" w:hAnsi="Times New Roman" w:cs="Times New Roman"/>
+        </w:rPr>
+        <w:t>third</w:t>
+      </w:r>
+      <w:r>
+        <w:rPr>
+          <w:rFonts w:ascii="Times New Roman" w:hAnsi="Times New Roman" w:cs="Times New Roman"/>
+        </w:rPr>
+        <w:t xml:space="preserve"> is the update as mentioned above)</w:t>
+      </w:r>
+      <w:r>
+        <w:rPr>
+          <w:rFonts w:ascii="Times New Roman" w:hAnsi="Times New Roman" w:cs="Times New Roman"/>
+        </w:rPr>
+        <w:t>:</w:t>
+      </w:r>
+    </w:p>
+    <w:p>
+      <w:pPr>
+        <w:rPr>
+          <w:rFonts w:ascii="Times New Roman" w:hAnsi="Times New Roman" w:cs="Times New Roman"/>
+          <w:noProof/>
+        </w:rPr>
+      </w:pPr>
+      <w:r>
+        <w:rPr>
+          <w:rFonts w:ascii="Times New Roman" w:hAnsi="Times New Roman" w:cs="Times New Roman"/>
+          <w:noProof/>
+        </w:rPr>
+        <w:drawing>
+          <wp:inline distT="0" distB="0" distL="0" distR="0" wp14:anchorId="547F2A89" wp14:editId="295790EA">
+            <wp:extent cx="2895028" cy="1851660"/>
+            <wp:effectExtent l="0" t="0" r="635" b="0"/>
+            <wp:docPr id="1447399948" name="Picture 79"/>
+            <wp:cNvGraphicFramePr>
+              <a:graphicFrameLocks xmlns:a="http://schemas.openxmlformats.org/drawingml/2006/main" noChangeAspect="1"/>
+            </wp:cNvGraphicFramePr>
+            <a:graphic xmlns:a="http://schemas.openxmlformats.org/drawingml/2006/main">
+              <a:graphicData uri="http://schemas.openxmlformats.org/drawingml/2006/picture">
+                <pic:pic xmlns:pic="http://schemas.openxmlformats.org/drawingml/2006/picture">
+                  <pic:nvPicPr>
+                    <pic:cNvPr id="0" name="Picture 4"/>
+                    <pic:cNvPicPr>
+                      <a:picLocks noChangeAspect="1" noChangeArrowheads="1"/>
+                    </pic:cNvPicPr>
+                  </pic:nvPicPr>
+                  <pic:blipFill rotWithShape="1">
+                    <a:blip r:embed="rId10" cstate="print">
+                      <a:extLst>
+                        <a:ext uri="{28A0092B-C50C-407E-A947-70E740481C1C}">
+                          <a14:useLocalDpi xmlns:a14="http://schemas.microsoft.com/office/drawing/2010/main" val="0"/>
+                        </a:ext>
+                      </a:extLst>
+                    </a:blip>
+                    <a:srcRect b="16852"/>
+                    <a:stretch/>
+                  </pic:blipFill>
+                  <pic:spPr bwMode="auto">
+                    <a:xfrm>
+                      <a:off x="0" y="0"/>
+                      <a:ext cx="2903568" cy="1857122"/>
+                    </a:xfrm>
+                    <a:prstGeom prst="rect">
+                      <a:avLst/>
+                    </a:prstGeom>
+                    <a:noFill/>
+                    <a:ln>
+                      <a:noFill/>
+                    </a:ln>
+                    <a:extLst>
+                      <a:ext uri="{53640926-AAD7-44D8-BBD7-CCE9431645EC}">
+                        <a14:shadowObscured xmlns:a14="http://schemas.microsoft.com/office/drawing/2010/main"/>
+                      </a:ext>
+                    </a:extLst>
+                  </pic:spPr>
+                </pic:pic>
+              </a:graphicData>
+            </a:graphic>
+          </wp:inline>
+        </w:drawing>
+      </w:r>
+    </w:p>
+    <w:p>
+      <w:pPr>
+        <w:rPr>
+          <w:rFonts w:ascii="Times New Roman" w:hAnsi="Times New Roman" w:cs="Times New Roman"/>
+          <w:noProof/>
+        </w:rPr>
+      </w:pPr>
+      <w:r>
+        <w:rPr>
+          <w:rFonts w:ascii="Times New Roman" w:hAnsi="Times New Roman" w:cs="Times New Roman"/>
+          <w:noProof/>
+        </w:rPr>
+        <w:t>(next image begins where top cutsoff)</w:t>
+      </w:r>
+    </w:p>
+    <w:p>
+      <w:pPr>
+        <w:rPr>
+          <w:rFonts w:ascii="Times New Roman" w:hAnsi="Times New Roman" w:cs="Times New Roman"/>
+        </w:rPr>
+      </w:pPr>
+      <w:r>
+        <w:rPr>
+          <w:rFonts w:ascii="Times New Roman" w:hAnsi="Times New Roman" w:cs="Times New Roman"/>
+          <w:noProof/>
+        </w:rPr>
+        <w:drawing>
+          <wp:inline distT="0" distB="0" distL="0" distR="0" wp14:anchorId="74CC5B6F" wp14:editId="1F5F2CFD">
+            <wp:extent cx="2506980" cy="2338705"/>
+            <wp:effectExtent l="0" t="0" r="7620" b="4445"/>
+            <wp:docPr id="1941902407" name="Picture 80"/>
+            <wp:cNvGraphicFramePr>
+              <a:graphicFrameLocks xmlns:a="http://schemas.openxmlformats.org/drawingml/2006/main" noChangeAspect="1"/>
+            </wp:cNvGraphicFramePr>
+            <a:graphic xmlns:a="http://schemas.openxmlformats.org/drawingml/2006/main">
+              <a:graphicData uri="http://schemas.openxmlformats.org/drawingml/2006/picture">
+                <pic:pic xmlns:pic="http://schemas.openxmlformats.org/drawingml/2006/picture">
+                  <pic:nvPicPr>
+                    <pic:cNvPr id="0" name="Picture 5"/>
+                    <pic:cNvPicPr>
+                      <a:picLocks noChangeAspect="1" noChangeArrowheads="1"/>
+                    </pic:cNvPicPr>
+                  </pic:nvPicPr>
+                  <pic:blipFill>
+                    <a:blip r:embed="rId11" cstate="print">
+                      <a:extLst>
+                        <a:ext uri="{28A0092B-C50C-407E-A947-70E740481C1C}">
+                          <a14:useLocalDpi xmlns:a14="http://schemas.microsoft.com/office/drawing/2010/main" val="0"/>
+                        </a:ext>
+                      </a:extLst>
+                    </a:blip>
+                    <a:srcRect/>
+                    <a:stretch>
+                      <a:fillRect/>
+                    </a:stretch>
+                  </pic:blipFill>
+                  <pic:spPr bwMode="auto">
+                    <a:xfrm>
+                      <a:off x="0" y="0"/>
+                      <a:ext cx="2517962" cy="2348950"/>
+                    </a:xfrm>
+                    <a:prstGeom prst="rect">
+                      <a:avLst/>
+                    </a:prstGeom>
+                    <a:noFill/>
+                    <a:ln>
+                      <a:noFill/>
+                    </a:ln>
+                  </pic:spPr>
+                </pic:pic>
+              </a:graphicData>
+            </a:graphic>
+          </wp:inline>
+        </w:drawing>
+      </w:r>
+    </w:p>
+    <w:p>
+      <w:pPr>
+        <w:rPr>
+          <w:rFonts w:ascii="Times New Roman" w:hAnsi="Times New Roman" w:cs="Times New Roman"/>
+        </w:rPr>
+      </w:pPr>
+    </w:p>
+    <w:p>
+      <w:pPr>
+        <w:rPr>
+          <w:rFonts w:ascii="Times New Roman" w:hAnsi="Times New Roman" w:cs="Times New Roman"/>
+        </w:rPr>
+      </w:pPr>
+    </w:p>
+    <w:p>
+      <w:pPr>
+        <w:rPr>
+          <w:rFonts w:ascii="Times New Roman" w:hAnsi="Times New Roman" w:cs="Times New Roman"/>
+        </w:rPr>
+      </w:pPr>
+    </w:p>
+    <w:p>
+      <w:pPr>
+        <w:rPr>
+          <w:rFonts w:ascii="Times New Roman" w:hAnsi="Times New Roman" w:cs="Times New Roman"/>
+        </w:rPr>
+      </w:pPr>
+    </w:p>
+    <w:p>
+      <w:pPr>
+        <w:rPr>
+          <w:rFonts w:ascii="Times New Roman" w:hAnsi="Times New Roman" w:cs="Times New Roman"/>
+        </w:rPr>
+      </w:pPr>
+    </w:p>
+    <w:p>
+      <w:pPr>
+        <w:rPr>
+          <w:rFonts w:ascii="Times New Roman" w:hAnsi="Times New Roman" w:cs="Times New Roman"/>
+        </w:rPr>
+      </w:pPr>
+      <w:r>
+        <w:rPr>
+          <w:rFonts w:ascii="Times New Roman" w:hAnsi="Times New Roman" w:cs="Times New Roman"/>
+          <w:noProof/>
+        </w:rPr>
+        <w:lastRenderedPageBreak/>
+        <w:drawing>
+          <wp:inline distT="0" distB="0" distL="0" distR="0" wp14:anchorId="6EEB8ED6" wp14:editId="1DF1CE9D">
+            <wp:extent cx="2463327" cy="2659380"/>
+            <wp:effectExtent l="0" t="0" r="0" b="7620"/>
+            <wp:docPr id="938264427" name="Picture 81"/>
+            <wp:cNvGraphicFramePr>
+              <a:graphicFrameLocks xmlns:a="http://schemas.openxmlformats.org/drawingml/2006/main" noChangeAspect="1"/>
+            </wp:cNvGraphicFramePr>
+            <a:graphic xmlns:a="http://schemas.openxmlformats.org/drawingml/2006/main">
+              <a:graphicData uri="http://schemas.openxmlformats.org/drawingml/2006/picture">
+                <pic:pic xmlns:pic="http://schemas.openxmlformats.org/drawingml/2006/picture">
+                  <pic:nvPicPr>
+                    <pic:cNvPr id="0" name="Picture 6"/>
+                    <pic:cNvPicPr>
+                      <a:picLocks noChangeAspect="1" noChangeArrowheads="1"/>
+                    </pic:cNvPicPr>
+                  </pic:nvPicPr>
+                  <pic:blipFill>
+                    <a:blip r:embed="rId12" cstate="print">
+                      <a:extLst>
+                        <a:ext uri="{28A0092B-C50C-407E-A947-70E740481C1C}">
+                          <a14:useLocalDpi xmlns:a14="http://schemas.microsoft.com/office/drawing/2010/main" val="0"/>
+                        </a:ext>
+                      </a:extLst>
+                    </a:blip>
+                    <a:srcRect/>
+                    <a:stretch>
+                      <a:fillRect/>
+                    </a:stretch>
+                  </pic:blipFill>
+                  <pic:spPr bwMode="auto">
+                    <a:xfrm>
+                      <a:off x="0" y="0"/>
+                      <a:ext cx="2468887" cy="2665383"/>
+                    </a:xfrm>
+                    <a:prstGeom prst="rect">
+                      <a:avLst/>
+                    </a:prstGeom>
+                    <a:noFill/>
+                    <a:ln>
+                      <a:noFill/>
+                    </a:ln>
+                  </pic:spPr>
+                </pic:pic>
+              </a:graphicData>
+            </a:graphic>
+          </wp:inline>
+        </w:drawing>
+      </w:r>
+    </w:p>
+    <w:p>
+      <w:pPr>
+        <w:rPr>
+          <w:rFonts w:ascii="Times New Roman" w:hAnsi="Times New Roman" w:cs="Times New Roman"/>
+        </w:rPr>
+      </w:pPr>
+      <w:r>
+        <w:rPr>
+          <w:rFonts w:ascii="Times New Roman" w:hAnsi="Times New Roman" w:cs="Times New Roman"/>
+        </w:rPr>
+        <w:t>Note how in this image, the employee id and car id are being retrieved (as mentioned as a case from the GET segment).</w:t>
+      </w:r>
+    </w:p>
+    <w:p>
+      <w:pPr>
+        <w:rPr>
+          <w:rFonts w:ascii="Times New Roman" w:hAnsi="Times New Roman" w:cs="Times New Roman"/>
+        </w:rPr>
+      </w:pPr>
+    </w:p>
+    <w:p>
+      <w:pPr>
+        <w:ind w:firstLine="720"/>
+        <w:rPr>
+          <w:rFonts w:ascii="Times New Roman" w:hAnsi="Times New Roman" w:cs="Times New Roman"/>
+        </w:rPr>
+      </w:pPr>
+      <w:r>
+        <w:rPr>
+          <w:rFonts w:ascii="Times New Roman" w:hAnsi="Times New Roman" w:cs="Times New Roman"/>
+        </w:rPr>
+        <w:t>The second half of the main function split is the POST as mentioned, the purpose of this half is to retrieve data from the forms generated by the GET segment. This segment is responsible for printing queried information to the screen in tables (the GET used queries to populate dropdowns</w:t>
+      </w:r>
+      <w:r>
+        <w:rPr>
+          <w:rFonts w:ascii="Times New Roman" w:hAnsi="Times New Roman" w:cs="Times New Roman"/>
+        </w:rPr>
+        <w:t xml:space="preserve">). Here is a code snippet of the POST segment for </w:t>
+      </w:r>
+      <w:r>
+        <w:rPr>
+          <w:rFonts w:ascii="Times New Roman" w:hAnsi="Times New Roman" w:cs="Times New Roman"/>
+        </w:rPr>
+        <w:t>the</w:t>
+      </w:r>
+      <w:r>
+        <w:rPr>
+          <w:rFonts w:ascii="Times New Roman" w:hAnsi="Times New Roman" w:cs="Times New Roman"/>
+        </w:rPr>
+        <w:t xml:space="preserve"> same listing </w:t>
+      </w:r>
+      <w:r>
+        <w:rPr>
+          <w:rFonts w:ascii="Times New Roman" w:hAnsi="Times New Roman" w:cs="Times New Roman"/>
+        </w:rPr>
+        <w:t>in the first two images shown for the GET segment:</w:t>
+      </w:r>
+    </w:p>
+    <w:p>
+      <w:pPr>
+        <w:ind w:firstLine="720"/>
+        <w:jc w:val="center"/>
+        <w:rPr>
+          <w:rFonts w:ascii="Times New Roman" w:hAnsi="Times New Roman" w:cs="Times New Roman"/>
+        </w:rPr>
+      </w:pPr>
+      <w:r>
+        <w:rPr>
+          <w:rFonts w:ascii="Times New Roman" w:hAnsi="Times New Roman" w:cs="Times New Roman"/>
+        </w:rPr>
+        <w:t>(Note that each image starts where the one above cuts off)</w:t>
+      </w:r>
+    </w:p>
+    <w:p>
+      <w:pPr>
+        <w:rPr>
+          <w:rFonts w:ascii="Times New Roman" w:hAnsi="Times New Roman" w:cs="Times New Roman"/>
+        </w:rPr>
+      </w:pPr>
+      <w:r>
+        <w:rPr>
+          <w:rFonts w:ascii="Times New Roman" w:hAnsi="Times New Roman" w:cs="Times New Roman"/>
+          <w:noProof/>
+        </w:rPr>
+        <w:drawing>
+          <wp:inline distT="0" distB="0" distL="0" distR="0" wp14:anchorId="6B594722" wp14:editId="0F1E93C9">
+            <wp:extent cx="2461260" cy="2590800"/>
+            <wp:effectExtent l="0" t="0" r="0" b="0"/>
+            <wp:docPr id="1820892359" name="Picture 82"/>
+            <wp:cNvGraphicFramePr>
+              <a:graphicFrameLocks xmlns:a="http://schemas.openxmlformats.org/drawingml/2006/main" noChangeAspect="1"/>
+            </wp:cNvGraphicFramePr>
+            <a:graphic xmlns:a="http://schemas.openxmlformats.org/drawingml/2006/main">
+              <a:graphicData uri="http://schemas.openxmlformats.org/drawingml/2006/picture">
+                <pic:pic xmlns:pic="http://schemas.openxmlformats.org/drawingml/2006/picture">
+                  <pic:nvPicPr>
+                    <pic:cNvPr id="0" name="Picture 7"/>
+                    <pic:cNvPicPr>
+                      <a:picLocks noChangeAspect="1" noChangeArrowheads="1"/>
+                    </pic:cNvPicPr>
+                  </pic:nvPicPr>
+                  <pic:blipFill>
+                    <a:blip r:embed="rId13" cstate="print">
+                      <a:extLst>
+                        <a:ext uri="{28A0092B-C50C-407E-A947-70E740481C1C}">
+                          <a14:useLocalDpi xmlns:a14="http://schemas.microsoft.com/office/drawing/2010/main" val="0"/>
+                        </a:ext>
+                      </a:extLst>
+                    </a:blip>
+                    <a:srcRect/>
+                    <a:stretch>
+                      <a:fillRect/>
+                    </a:stretch>
+                  </pic:blipFill>
+                  <pic:spPr bwMode="auto">
+                    <a:xfrm>
+                      <a:off x="0" y="0"/>
+                      <a:ext cx="2467161" cy="2597012"/>
+                    </a:xfrm>
+                    <a:prstGeom prst="rect">
+                      <a:avLst/>
+                    </a:prstGeom>
+                    <a:noFill/>
+                    <a:ln>
+                      <a:noFill/>
+                    </a:ln>
+                  </pic:spPr>
+                </pic:pic>
+              </a:graphicData>
+            </a:graphic>
+          </wp:inline>
+        </w:drawing>
+      </w:r>
+    </w:p>
+    <w:p>
+      <w:pPr>
+        <w:rPr>
+          <w:rFonts w:ascii="Times New Roman" w:hAnsi="Times New Roman" w:cs="Times New Roman"/>
+        </w:rPr>
+      </w:pPr>
+      <w:r>
+        <w:rPr>
+          <w:rFonts w:ascii="Times New Roman" w:hAnsi="Times New Roman" w:cs="Times New Roman"/>
+        </w:rPr>
+        <w:t xml:space="preserve">In this image </w:t>
+      </w:r>
+      <w:r>
+        <w:rPr>
+          <w:rFonts w:ascii="Times New Roman" w:hAnsi="Times New Roman" w:cs="Times New Roman"/>
+        </w:rPr>
+        <w:t>we get post data and determine where it came from, this is chosen based on one of the hidden inputs sent from the respective form</w:t>
+      </w:r>
+      <w:r>
+        <w:rPr>
+          <w:rFonts w:ascii="Times New Roman" w:hAnsi="Times New Roman" w:cs="Times New Roman"/>
+        </w:rPr>
+        <w:t>. We then print the text html header.</w:t>
+      </w:r>
+    </w:p>
+    <w:p>
+      <w:pPr>
+        <w:rPr>
+          <w:rFonts w:ascii="Times New Roman" w:hAnsi="Times New Roman" w:cs="Times New Roman"/>
+        </w:rPr>
+      </w:pPr>
+      <w:r>
+        <w:rPr>
+          <w:rFonts w:ascii="Times New Roman" w:hAnsi="Times New Roman" w:cs="Times New Roman"/>
+          <w:noProof/>
+        </w:rPr>
+        <w:lastRenderedPageBreak/>
+        <w:drawing>
+          <wp:inline distT="0" distB="0" distL="0" distR="0" wp14:anchorId="35C92F93" wp14:editId="4ACB3616">
+            <wp:extent cx="2901106" cy="2644140"/>
+            <wp:effectExtent l="0" t="0" r="0" b="3810"/>
+            <wp:docPr id="878777380" name="Picture 83"/>
+            <wp:cNvGraphicFramePr>
+              <a:graphicFrameLocks xmlns:a="http://schemas.openxmlformats.org/drawingml/2006/main" noChangeAspect="1"/>
+            </wp:cNvGraphicFramePr>
+            <a:graphic xmlns:a="http://schemas.openxmlformats.org/drawingml/2006/main">
+              <a:graphicData uri="http://schemas.openxmlformats.org/drawingml/2006/picture">
+                <pic:pic xmlns:pic="http://schemas.openxmlformats.org/drawingml/2006/picture">
+                  <pic:nvPicPr>
+                    <pic:cNvPr id="0" name="Picture 8"/>
+                    <pic:cNvPicPr>
+                      <a:picLocks noChangeAspect="1" noChangeArrowheads="1"/>
+                    </pic:cNvPicPr>
+                  </pic:nvPicPr>
+                  <pic:blipFill>
+                    <a:blip r:embed="rId14" cstate="print">
+                      <a:extLst>
+                        <a:ext uri="{28A0092B-C50C-407E-A947-70E740481C1C}">
+                          <a14:useLocalDpi xmlns:a14="http://schemas.microsoft.com/office/drawing/2010/main" val="0"/>
+                        </a:ext>
+                      </a:extLst>
+                    </a:blip>
+                    <a:srcRect/>
+                    <a:stretch>
+                      <a:fillRect/>
+                    </a:stretch>
+                  </pic:blipFill>
+                  <pic:spPr bwMode="auto">
+                    <a:xfrm>
+                      <a:off x="0" y="0"/>
+                      <a:ext cx="2911308" cy="2653439"/>
+                    </a:xfrm>
+                    <a:prstGeom prst="rect">
+                      <a:avLst/>
+                    </a:prstGeom>
+                    <a:noFill/>
+                    <a:ln>
+                      <a:noFill/>
+                    </a:ln>
+                  </pic:spPr>
+                </pic:pic>
+              </a:graphicData>
+            </a:graphic>
+          </wp:inline>
+        </w:drawing>
+      </w:r>
+    </w:p>
+    <w:p>
+      <w:pPr>
+        <w:rPr>
+          <w:rFonts w:ascii="Times New Roman" w:hAnsi="Times New Roman" w:cs="Times New Roman"/>
+        </w:rPr>
+      </w:pPr>
+      <w:r>
+        <w:rPr>
+          <w:rFonts w:ascii="Times New Roman" w:hAnsi="Times New Roman" w:cs="Times New Roman"/>
+        </w:rPr>
+        <w:t>In this image we connect to the database, create the statement</w:t>
+      </w:r>
+      <w:r>
+        <w:rPr>
+          <w:rFonts w:ascii="Times New Roman" w:hAnsi="Times New Roman" w:cs="Times New Roman"/>
+        </w:rPr>
+        <w:t xml:space="preserve"> to get all attributes from the car table where the color </w:t>
+      </w:r>
+      <w:r>
+        <w:rPr>
+          <w:rFonts w:ascii="Times New Roman" w:hAnsi="Times New Roman" w:cs="Times New Roman"/>
+        </w:rPr>
+        <w:t>is</w:t>
+      </w:r>
+      <w:r>
+        <w:rPr>
+          <w:rFonts w:ascii="Times New Roman" w:hAnsi="Times New Roman" w:cs="Times New Roman"/>
+        </w:rPr>
+        <w:t xml:space="preserve"> extracted from the post data. </w:t>
+      </w:r>
+      <w:r>
+        <w:rPr>
+          <w:rFonts w:ascii="Times New Roman" w:hAnsi="Times New Roman" w:cs="Times New Roman"/>
+        </w:rPr>
+        <w:t>Then we print the table header and prep to iterate through the ‘steps’ (in C and C++ this means rows)</w:t>
+      </w:r>
+      <w:r>
+        <w:rPr>
+          <w:rFonts w:ascii="Times New Roman" w:hAnsi="Times New Roman" w:cs="Times New Roman"/>
+        </w:rPr>
+        <w:t xml:space="preserve"> for each table row. </w:t>
+      </w:r>
+    </w:p>
+    <w:p>
+      <w:pPr>
+        <w:rPr>
+          <w:rFonts w:ascii="Times New Roman" w:hAnsi="Times New Roman" w:cs="Times New Roman"/>
+        </w:rPr>
+      </w:pPr>
+      <w:r>
+        <w:rPr>
+          <w:rFonts w:ascii="Times New Roman" w:hAnsi="Times New Roman" w:cs="Times New Roman"/>
+          <w:noProof/>
+        </w:rPr>
+        <w:drawing>
+          <wp:inline distT="0" distB="0" distL="0" distR="0" wp14:anchorId="7E7CEECB" wp14:editId="3AEE1398">
+            <wp:extent cx="3583803" cy="2476500"/>
+            <wp:effectExtent l="0" t="0" r="0" b="0"/>
+            <wp:docPr id="978743195" name="Picture 84"/>
+            <wp:cNvGraphicFramePr>
+              <a:graphicFrameLocks xmlns:a="http://schemas.openxmlformats.org/drawingml/2006/main" noChangeAspect="1"/>
+            </wp:cNvGraphicFramePr>
+            <a:graphic xmlns:a="http://schemas.openxmlformats.org/drawingml/2006/main">
+              <a:graphicData uri="http://schemas.openxmlformats.org/drawingml/2006/picture">
+                <pic:pic xmlns:pic="http://schemas.openxmlformats.org/drawingml/2006/picture">
+                  <pic:nvPicPr>
+                    <pic:cNvPr id="0" name="Picture 9"/>
+                    <pic:cNvPicPr>
+                      <a:picLocks noChangeAspect="1" noChangeArrowheads="1"/>
+                    </pic:cNvPicPr>
+                  </pic:nvPicPr>
+                  <pic:blipFill>
+                    <a:blip r:embed="rId15" cstate="print">
+                      <a:extLst>
+                        <a:ext uri="{28A0092B-C50C-407E-A947-70E740481C1C}">
+                          <a14:useLocalDpi xmlns:a14="http://schemas.microsoft.com/office/drawing/2010/main" val="0"/>
+                        </a:ext>
+                      </a:extLst>
+                    </a:blip>
+                    <a:srcRect/>
+                    <a:stretch>
+                      <a:fillRect/>
+                    </a:stretch>
+                  </pic:blipFill>
+                  <pic:spPr bwMode="auto">
+                    <a:xfrm>
+                      <a:off x="0" y="0"/>
+                      <a:ext cx="3586989" cy="2478702"/>
+                    </a:xfrm>
+                    <a:prstGeom prst="rect">
+                      <a:avLst/>
+                    </a:prstGeom>
+                    <a:noFill/>
+                    <a:ln>
+                      <a:noFill/>
+                    </a:ln>
+                  </pic:spPr>
+                </pic:pic>
+              </a:graphicData>
+            </a:graphic>
+          </wp:inline>
+        </w:drawing>
+      </w:r>
+    </w:p>
+    <w:p>
+      <w:pPr>
+        <w:rPr>
+          <w:rFonts w:ascii="Times New Roman" w:hAnsi="Times New Roman" w:cs="Times New Roman"/>
+        </w:rPr>
+      </w:pPr>
+      <w:r>
+        <w:rPr>
+          <w:rFonts w:ascii="Times New Roman" w:hAnsi="Times New Roman" w:cs="Times New Roman"/>
+        </w:rPr>
+        <w:t>In this image we perform the iteration as was mentioned</w:t>
+      </w:r>
+      <w:r>
+        <w:rPr>
+          <w:rFonts w:ascii="Times New Roman" w:hAnsi="Times New Roman" w:cs="Times New Roman"/>
+        </w:rPr>
+        <w:t>, then close the table, statement, then database connection. Note that</w:t>
+      </w:r>
+      <w:r>
+        <w:rPr>
+          <w:rFonts w:ascii="Times New Roman" w:hAnsi="Times New Roman" w:cs="Times New Roman"/>
+        </w:rPr>
+        <w:t xml:space="preserve"> in C there are no classes (only structs) so the sqlite3 functions are never called on an object, the object is the parameter (where the connection and statements are also </w:t>
+      </w:r>
+      <w:proofErr w:type="gramStart"/>
+      <w:r>
+        <w:rPr>
+          <w:rFonts w:ascii="Times New Roman" w:hAnsi="Times New Roman" w:cs="Times New Roman"/>
+        </w:rPr>
+        <w:t>structs</w:t>
+      </w:r>
+      <w:proofErr w:type="gramEnd"/>
+      <w:r>
+        <w:rPr>
+          <w:rFonts w:ascii="Times New Roman" w:hAnsi="Times New Roman" w:cs="Times New Roman"/>
+        </w:rPr>
+        <w:t>). This is a result of the sqlite3</w:t>
+      </w:r>
+      <w:r>
+        <w:rPr>
+          <w:rFonts w:ascii="Times New Roman" w:hAnsi="Times New Roman" w:cs="Times New Roman"/>
+        </w:rPr>
+        <w:t xml:space="preserve"> module being programmed in C (this also applies to C++ SQLite database programming which is programmed in the same way despite having classes). </w:t>
+      </w:r>
+    </w:p>
+    <w:p>
+      <w:pPr>
+        <w:rPr>
+          <w:rFonts w:ascii="Times New Roman" w:hAnsi="Times New Roman" w:cs="Times New Roman"/>
+        </w:rPr>
+      </w:pPr>
+      <w:r>
+        <w:rPr>
+          <w:rFonts w:ascii="Times New Roman" w:hAnsi="Times New Roman" w:cs="Times New Roman"/>
+          <w:noProof/>
+        </w:rPr>
+        <w:lastRenderedPageBreak/>
+        <w:drawing>
+          <wp:inline distT="0" distB="0" distL="0" distR="0" wp14:anchorId="7E78F8F6" wp14:editId="695CDF78">
+            <wp:extent cx="3037228" cy="2506980"/>
+            <wp:effectExtent l="0" t="0" r="0" b="7620"/>
+            <wp:docPr id="992261745" name="Picture 85"/>
+            <wp:cNvGraphicFramePr>
+              <a:graphicFrameLocks xmlns:a="http://schemas.openxmlformats.org/drawingml/2006/main" noChangeAspect="1"/>
+            </wp:cNvGraphicFramePr>
+            <a:graphic xmlns:a="http://schemas.openxmlformats.org/drawingml/2006/main">
+              <a:graphicData uri="http://schemas.openxmlformats.org/drawingml/2006/picture">
+                <pic:pic xmlns:pic="http://schemas.openxmlformats.org/drawingml/2006/picture">
+                  <pic:nvPicPr>
+                    <pic:cNvPr id="0" name="Picture 10"/>
+                    <pic:cNvPicPr>
+                      <a:picLocks noChangeAspect="1" noChangeArrowheads="1"/>
+                    </pic:cNvPicPr>
+                  </pic:nvPicPr>
+                  <pic:blipFill>
+                    <a:blip r:embed="rId16" cstate="print">
+                      <a:extLst>
+                        <a:ext uri="{28A0092B-C50C-407E-A947-70E740481C1C}">
+                          <a14:useLocalDpi xmlns:a14="http://schemas.microsoft.com/office/drawing/2010/main" val="0"/>
+                        </a:ext>
+                      </a:extLst>
+                    </a:blip>
+                    <a:srcRect/>
+                    <a:stretch>
+                      <a:fillRect/>
+                    </a:stretch>
+                  </pic:blipFill>
+                  <pic:spPr bwMode="auto">
+                    <a:xfrm>
+                      <a:off x="0" y="0"/>
+                      <a:ext cx="3041943" cy="2510872"/>
+                    </a:xfrm>
+                    <a:prstGeom prst="rect">
+                      <a:avLst/>
+                    </a:prstGeom>
+                    <a:noFill/>
+                    <a:ln>
+                      <a:noFill/>
+                    </a:ln>
+                  </pic:spPr>
+                </pic:pic>
+              </a:graphicData>
+            </a:graphic>
+          </wp:inline>
+        </w:drawing>
+      </w:r>
+    </w:p>
+    <w:p>
+      <w:pPr>
+        <w:rPr>
+          <w:rFonts w:ascii="Times New Roman" w:hAnsi="Times New Roman" w:cs="Times New Roman"/>
+        </w:rPr>
+      </w:pPr>
+      <w:r>
+        <w:rPr>
+          <w:rFonts w:ascii="Times New Roman" w:hAnsi="Times New Roman" w:cs="Times New Roman"/>
+        </w:rPr>
+        <w:t>In this image, we are now performing the GET</w:t>
+      </w:r>
+      <w:r>
+        <w:rPr>
+          <w:rFonts w:ascii="Times New Roman" w:hAnsi="Times New Roman" w:cs="Times New Roman"/>
+        </w:rPr>
+        <w:t xml:space="preserve"> segments responsibility. This is so the form can be generated after the query data is printed, allowing for the user to filter search again without reloading the page (also </w:t>
+      </w:r>
+      <w:r>
+        <w:rPr>
+          <w:rFonts w:ascii="Times New Roman" w:hAnsi="Times New Roman" w:cs="Times New Roman"/>
+        </w:rPr>
+        <w:t>works in the case there was an error either with the database or nothing returned (technically impossible since the colors are listed</w:t>
+      </w:r>
+      <w:r>
+        <w:rPr>
+          <w:rFonts w:ascii="Times New Roman" w:hAnsi="Times New Roman" w:cs="Times New Roman"/>
+        </w:rPr>
+        <w:t xml:space="preserve"> in a dropdown based on what (distinct) colors are in the table).</w:t>
+      </w:r>
+    </w:p>
+    <w:p>
+      <w:pPr>
+        <w:rPr>
+          <w:rFonts w:ascii="Times New Roman" w:hAnsi="Times New Roman" w:cs="Times New Roman"/>
+        </w:rPr>
+      </w:pPr>
+      <w:r>
+        <w:rPr>
+          <w:rFonts w:ascii="Times New Roman" w:hAnsi="Times New Roman" w:cs="Times New Roman"/>
+          <w:noProof/>
+        </w:rPr>
+        <w:drawing>
+          <wp:inline distT="0" distB="0" distL="0" distR="0" wp14:anchorId="7628C85D" wp14:editId="0BACE779">
+            <wp:extent cx="3680630" cy="3185160"/>
+            <wp:effectExtent l="0" t="0" r="0" b="0"/>
+            <wp:docPr id="338060157" name="Picture 86" descr="A screenshot of a computer program&#10;&#10;AI-generated content may be incorrect."/>
+            <wp:cNvGraphicFramePr>
+              <a:graphicFrameLocks xmlns:a="http://schemas.openxmlformats.org/drawingml/2006/main" noChangeAspect="1"/>
+            </wp:cNvGraphicFramePr>
+            <a:graphic xmlns:a="http://schemas.openxmlformats.org/drawingml/2006/main">
+              <a:graphicData uri="http://schemas.openxmlformats.org/drawingml/2006/picture">
+                <pic:pic xmlns:pic="http://schemas.openxmlformats.org/drawingml/2006/picture">
+                  <pic:nvPicPr>
+                    <pic:cNvPr id="338060157" name="Picture 86" descr="A screenshot of a computer program&#10;&#10;AI-generated content may be incorrect."/>
+                    <pic:cNvPicPr>
+                      <a:picLocks noChangeAspect="1" noChangeArrowheads="1"/>
+                    </pic:cNvPicPr>
+                  </pic:nvPicPr>
+                  <pic:blipFill>
+                    <a:blip r:embed="rId17">
+                      <a:extLst>
+                        <a:ext uri="{28A0092B-C50C-407E-A947-70E740481C1C}">
+                          <a14:useLocalDpi xmlns:a14="http://schemas.microsoft.com/office/drawing/2010/main" val="0"/>
+                        </a:ext>
+                      </a:extLst>
+                    </a:blip>
+                    <a:srcRect/>
+                    <a:stretch>
+                      <a:fillRect/>
+                    </a:stretch>
+                  </pic:blipFill>
+                  <pic:spPr bwMode="auto">
+                    <a:xfrm>
+                      <a:off x="0" y="0"/>
+                      <a:ext cx="3690882" cy="3194032"/>
+                    </a:xfrm>
+                    <a:prstGeom prst="rect">
+                      <a:avLst/>
+                    </a:prstGeom>
+                    <a:noFill/>
+                    <a:ln>
+                      <a:noFill/>
+                    </a:ln>
+                  </pic:spPr>
+                </pic:pic>
+              </a:graphicData>
+            </a:graphic>
+          </wp:inline>
+        </w:drawing>
+      </w:r>
+    </w:p>
+    <w:p>
+      <w:pPr>
+        <w:rPr>
+          <w:rFonts w:ascii="Times New Roman" w:hAnsi="Times New Roman" w:cs="Times New Roman"/>
+        </w:rPr>
+      </w:pPr>
+      <w:r>
+        <w:rPr>
+          <w:rFonts w:ascii="Times New Roman" w:hAnsi="Times New Roman" w:cs="Times New Roman"/>
+        </w:rPr>
+        <w:t xml:space="preserve">Finally in this image we </w:t>
+      </w:r>
+      <w:r>
+        <w:rPr>
+          <w:rFonts w:ascii="Times New Roman" w:hAnsi="Times New Roman" w:cs="Times New Roman"/>
+        </w:rPr>
+        <w:t>close the database connection and statements and exit the program (will be called whenever (every time) a GET or POST is made).</w:t>
+      </w:r>
+    </w:p>
+    <w:p>
+      <w:pPr>
+        <w:rPr>
+          <w:rFonts w:ascii="Times New Roman" w:hAnsi="Times New Roman" w:cs="Times New Roman"/>
+        </w:rPr>
       </w:pPr>
     </w:p>
     <w:p>
@@ -544,700 +2781,766 @@
       <w:pPr>
         <w:rPr>
           <w:rFonts w:ascii="Times New Roman" w:hAnsi="Times New Roman" w:cs="Times New Roman"/>
-          <w:b/>
-          <w:bCs/>
-        </w:rPr>
-      </w:pPr>
-    </w:p>
-    <w:p>
-      <w:pPr>
-        <w:rPr>
-          <w:rFonts w:ascii="Times New Roman" w:hAnsi="Times New Roman" w:cs="Times New Roman"/>
-          <w:b/>
-          <w:bCs/>
-        </w:rPr>
-      </w:pPr>
-    </w:p>
-    <w:p>
-      <w:pPr>
-        <w:rPr>
-          <w:rFonts w:ascii="Times New Roman" w:hAnsi="Times New Roman" w:cs="Times New Roman"/>
-          <w:b/>
-          <w:bCs/>
-        </w:rPr>
-      </w:pPr>
-    </w:p>
-    <w:p>
-      <w:pPr>
-        <w:jc w:val="center"/>
-        <w:rPr>
-          <w:rFonts w:ascii="Times New Roman" w:hAnsi="Times New Roman" w:cs="Times New Roman"/>
-          <w:b/>
-          <w:bCs/>
-        </w:rPr>
-      </w:pPr>
-      <w:r>
-        <w:rPr>
-          <w:rFonts w:ascii="Times New Roman" w:hAnsi="Times New Roman" w:cs="Times New Roman"/>
-          <w:b/>
-          <w:bCs/>
+        </w:rPr>
+      </w:pPr>
+      <w:r>
+        <w:rPr>
+          <w:rFonts w:ascii="Times New Roman" w:hAnsi="Times New Roman" w:cs="Times New Roman"/>
         </w:rPr>
         <w:lastRenderedPageBreak/>
-        <w:t>Data Modeling</w:t>
-      </w:r>
-    </w:p>
-    <w:p>
-      <w:pPr>
-        <w:rPr>
-          <w:rFonts w:ascii="Times New Roman" w:hAnsi="Times New Roman" w:cs="Times New Roman"/>
-        </w:rPr>
-      </w:pPr>
-      <w:r>
-        <w:rPr>
-          <w:rFonts w:ascii="Times New Roman" w:hAnsi="Times New Roman" w:cs="Times New Roman"/>
-        </w:rPr>
-        <w:t>The low-level relational and conceptual model of the database is as follows:</w:t>
-      </w:r>
-    </w:p>
-    <w:p>
-      <w:pPr>
-        <w:rPr>
-          <w:rFonts w:ascii="Times New Roman" w:hAnsi="Times New Roman" w:cs="Times New Roman"/>
-        </w:rPr>
-      </w:pPr>
-      <w:r>
-        <w:rPr>
-          <w:rFonts w:ascii="Times New Roman" w:hAnsi="Times New Roman" w:cs="Times New Roman"/>
-        </w:rPr>
-        <w:t>Record:</w:t>
-      </w:r>
-    </w:p>
-    <w:p>
-      <w:pPr>
-        <w:rPr>
-          <w:rFonts w:ascii="Times New Roman" w:hAnsi="Times New Roman" w:cs="Times New Roman"/>
-        </w:rPr>
-      </w:pPr>
-      <w:r>
-        <w:rPr>
-          <w:rFonts w:ascii="Times New Roman" w:hAnsi="Times New Roman" w:cs="Times New Roman"/>
-        </w:rPr>
-        <w:t>Id (pk)</w:t>
-      </w:r>
-      <w:r>
-        <w:rPr>
-          <w:rFonts w:ascii="Times New Roman" w:hAnsi="Times New Roman" w:cs="Times New Roman"/>
-        </w:rPr>
-        <w:t>,</w:t>
-      </w:r>
-      <w:r>
-        <w:rPr>
-          <w:rFonts w:ascii="Times New Roman" w:hAnsi="Times New Roman" w:cs="Times New Roman"/>
-        </w:rPr>
-        <w:t xml:space="preserve"> Employee (</w:t>
+        <w:t>In terms of the actual queries being used, the only times compound (</w:t>
+      </w:r>
+      <w:r>
+        <w:rPr>
+          <w:rFonts w:ascii="Times New Roman" w:hAnsi="Times New Roman" w:cs="Times New Roman"/>
+        </w:rPr>
+        <w:t>join) is used is whenever the make and model names are needed since the model must have the same make (f</w:t>
       </w:r>
       <w:proofErr w:type="spellStart"/>
       <w:r>
         <w:rPr>
           <w:rFonts w:ascii="Times New Roman" w:hAnsi="Times New Roman" w:cs="Times New Roman"/>
         </w:rPr>
-        <w:t>fk</w:t>
+        <w:t>k</w:t>
       </w:r>
       <w:proofErr w:type="spellEnd"/>
       <w:r>
         <w:rPr>
           <w:rFonts w:ascii="Times New Roman" w:hAnsi="Times New Roman" w:cs="Times New Roman"/>
         </w:rPr>
-        <w:t xml:space="preserve"> to </w:t>
+        <w:t>) as the make ID (pk)</w:t>
+      </w:r>
+      <w:r>
+        <w:rPr>
+          <w:rFonts w:ascii="Times New Roman" w:hAnsi="Times New Roman" w:cs="Times New Roman"/>
+        </w:rPr>
+        <w:t xml:space="preserve">. Select is used in all cases where forms need population, employee login, </w:t>
+      </w:r>
+      <w:r>
+        <w:rPr>
+          <w:rFonts w:ascii="Times New Roman" w:hAnsi="Times New Roman" w:cs="Times New Roman"/>
+        </w:rPr>
+        <w:t xml:space="preserve">and car data retrieval. Insert is used for adding cars and records. Delete and update are used for </w:t>
+      </w:r>
+      <w:r>
+        <w:rPr>
+          <w:rFonts w:ascii="Times New Roman" w:hAnsi="Times New Roman" w:cs="Times New Roman"/>
+        </w:rPr>
+        <w:t xml:space="preserve">their respective operation only on cars. This is a result primarily of not wanting records to be delete-able or update-able, as well as the user never being able to add makes or models to the database (they are inherently there and just as in the case of records, a database admin can add </w:t>
+      </w:r>
+      <w:r>
+        <w:rPr>
+          <w:rFonts w:ascii="Times New Roman" w:hAnsi="Times New Roman" w:cs="Times New Roman"/>
+        </w:rPr>
+        <w:t>and view them).</w:t>
+      </w:r>
+      <w:r>
+        <w:rPr>
+          <w:rFonts w:ascii="Times New Roman" w:hAnsi="Times New Roman" w:cs="Times New Roman"/>
+        </w:rPr>
+        <w:t xml:space="preserve"> For the sake of showing some of the queries (without pictures), here are some of the ones found within the </w:t>
+      </w:r>
+      <w:r>
+        <w:rPr>
+          <w:rFonts w:ascii="Times New Roman" w:hAnsi="Times New Roman" w:cs="Times New Roman"/>
+        </w:rPr>
+        <w:t>implementation:</w:t>
+      </w:r>
+    </w:p>
+    <w:p>
+      <w:pPr>
+        <w:rPr>
+          <w:rFonts w:ascii="Times New Roman" w:hAnsi="Times New Roman" w:cs="Times New Roman"/>
+        </w:rPr>
+      </w:pPr>
+      <w:r>
+        <w:rPr>
+          <w:rFonts w:ascii="Times New Roman" w:hAnsi="Times New Roman" w:cs="Times New Roman"/>
+        </w:rPr>
+        <w:t>SELECT * FROM Car</w:t>
+      </w:r>
+    </w:p>
+    <w:p>
+      <w:pPr>
+        <w:rPr>
+          <w:rFonts w:ascii="Times New Roman" w:hAnsi="Times New Roman" w:cs="Times New Roman"/>
+        </w:rPr>
+      </w:pPr>
+      <w:r>
+        <w:rPr>
+          <w:rFonts w:ascii="Times New Roman" w:hAnsi="Times New Roman" w:cs="Times New Roman"/>
+        </w:rPr>
+        <w:t xml:space="preserve">SELECT </w:t>
       </w:r>
       <w:proofErr w:type="spellStart"/>
       <w:r>
         <w:rPr>
           <w:rFonts w:ascii="Times New Roman" w:hAnsi="Times New Roman" w:cs="Times New Roman"/>
         </w:rPr>
-        <w:t>Employee.Id</w:t>
+        <w:t>Make.Name</w:t>
       </w:r>
       <w:proofErr w:type="spellEnd"/>
       <w:r>
         <w:rPr>
           <w:rFonts w:ascii="Times New Roman" w:hAnsi="Times New Roman" w:cs="Times New Roman"/>
         </w:rPr>
-        <w:t xml:space="preserve">), Time, </w:t>
+        <w:t xml:space="preserve">, </w:t>
       </w:r>
       <w:proofErr w:type="spellStart"/>
       <w:r>
         <w:rPr>
           <w:rFonts w:ascii="Times New Roman" w:hAnsi="Times New Roman" w:cs="Times New Roman"/>
         </w:rPr>
+        <w:t>Model.Name</w:t>
+      </w:r>
+      <w:proofErr w:type="spellEnd"/>
+      <w:r>
+        <w:rPr>
+          <w:rFonts w:ascii="Times New Roman" w:hAnsi="Times New Roman" w:cs="Times New Roman"/>
+        </w:rPr>
+        <w:t xml:space="preserve"> FROM Make, Model WHERE </w:t>
+      </w:r>
+      <w:proofErr w:type="spellStart"/>
+      <w:r>
+        <w:rPr>
+          <w:rFonts w:ascii="Times New Roman" w:hAnsi="Times New Roman" w:cs="Times New Roman"/>
+        </w:rPr>
+        <w:t>Make.Id</w:t>
+      </w:r>
+      <w:proofErr w:type="spellEnd"/>
+      <w:r>
+        <w:rPr>
+          <w:rFonts w:ascii="Times New Roman" w:hAnsi="Times New Roman" w:cs="Times New Roman"/>
+        </w:rPr>
+        <w:t xml:space="preserve"> </w:t>
+      </w:r>
+      <w:proofErr w:type="gramStart"/>
+      <w:r>
+        <w:rPr>
+          <w:rFonts w:ascii="Times New Roman" w:hAnsi="Times New Roman" w:cs="Times New Roman"/>
+        </w:rPr>
+        <w:t>= ?</w:t>
+      </w:r>
+      <w:proofErr w:type="gramEnd"/>
+      <w:r>
+        <w:rPr>
+          <w:rFonts w:ascii="Times New Roman" w:hAnsi="Times New Roman" w:cs="Times New Roman"/>
+        </w:rPr>
+        <w:t xml:space="preserve"> AND </w:t>
+      </w:r>
+      <w:proofErr w:type="spellStart"/>
+      <w:r>
+        <w:rPr>
+          <w:rFonts w:ascii="Times New Roman" w:hAnsi="Times New Roman" w:cs="Times New Roman"/>
+        </w:rPr>
+        <w:t>Model.Id</w:t>
+      </w:r>
+      <w:proofErr w:type="spellEnd"/>
+      <w:r>
+        <w:rPr>
+          <w:rFonts w:ascii="Times New Roman" w:hAnsi="Times New Roman" w:cs="Times New Roman"/>
+        </w:rPr>
+        <w:t xml:space="preserve"> </w:t>
+      </w:r>
+      <w:proofErr w:type="gramStart"/>
+      <w:r>
+        <w:rPr>
+          <w:rFonts w:ascii="Times New Roman" w:hAnsi="Times New Roman" w:cs="Times New Roman"/>
+        </w:rPr>
+        <w:t>= ?</w:t>
+      </w:r>
+      <w:proofErr w:type="gramEnd"/>
+    </w:p>
+    <w:p>
+      <w:pPr>
+        <w:rPr>
+          <w:rFonts w:ascii="Times New Roman" w:hAnsi="Times New Roman" w:cs="Times New Roman"/>
+        </w:rPr>
+      </w:pPr>
+      <w:r>
+        <w:rPr>
+          <w:rFonts w:ascii="Times New Roman" w:hAnsi="Times New Roman" w:cs="Times New Roman"/>
+        </w:rPr>
+        <w:t xml:space="preserve">SELECT </w:t>
+      </w:r>
+      <w:proofErr w:type="spellStart"/>
+      <w:proofErr w:type="gramStart"/>
+      <w:r>
+        <w:rPr>
+          <w:rFonts w:ascii="Times New Roman" w:hAnsi="Times New Roman" w:cs="Times New Roman"/>
+        </w:rPr>
+        <w:t>LicPlate</w:t>
+      </w:r>
+      <w:proofErr w:type="spellEnd"/>
+      <w:proofErr w:type="gramEnd"/>
+      <w:r>
+        <w:rPr>
+          <w:rFonts w:ascii="Times New Roman" w:hAnsi="Times New Roman" w:cs="Times New Roman"/>
+        </w:rPr>
+        <w:t xml:space="preserve"> FROM Car</w:t>
+      </w:r>
+    </w:p>
+    <w:p>
+      <w:pPr>
+        <w:rPr>
+          <w:rFonts w:ascii="Times New Roman" w:hAnsi="Times New Roman" w:cs="Times New Roman"/>
+        </w:rPr>
+      </w:pPr>
+      <w:r>
+        <w:rPr>
+          <w:rFonts w:ascii="Times New Roman" w:hAnsi="Times New Roman" w:cs="Times New Roman"/>
+        </w:rPr>
+        <w:t>SELECT DISTINCT Color FROM Car</w:t>
+      </w:r>
+    </w:p>
+    <w:p>
+      <w:pPr>
+        <w:rPr>
+          <w:rFonts w:ascii="Times New Roman" w:hAnsi="Times New Roman" w:cs="Times New Roman"/>
+        </w:rPr>
+      </w:pPr>
+      <w:r>
+        <w:rPr>
+          <w:rFonts w:ascii="Times New Roman" w:hAnsi="Times New Roman" w:cs="Times New Roman"/>
+        </w:rPr>
+        <w:t xml:space="preserve">SELECT * FROM Car WHERE Id </w:t>
+      </w:r>
+      <w:proofErr w:type="gramStart"/>
+      <w:r>
+        <w:rPr>
+          <w:rFonts w:ascii="Times New Roman" w:hAnsi="Times New Roman" w:cs="Times New Roman"/>
+        </w:rPr>
+        <w:t>= ?</w:t>
+      </w:r>
+      <w:proofErr w:type="gramEnd"/>
+    </w:p>
+    <w:p>
+      <w:pPr>
+        <w:rPr>
+          <w:rFonts w:ascii="Times New Roman" w:hAnsi="Times New Roman" w:cs="Times New Roman"/>
+        </w:rPr>
+      </w:pPr>
+      <w:r>
+        <w:rPr>
+          <w:rFonts w:ascii="Times New Roman" w:hAnsi="Times New Roman" w:cs="Times New Roman"/>
+        </w:rPr>
+        <w:t xml:space="preserve">SELECT </w:t>
+      </w:r>
+      <w:proofErr w:type="spellStart"/>
+      <w:r>
+        <w:rPr>
+          <w:rFonts w:ascii="Times New Roman" w:hAnsi="Times New Roman" w:cs="Times New Roman"/>
+        </w:rPr>
+        <w:t>Make.Name</w:t>
+      </w:r>
+      <w:proofErr w:type="spellEnd"/>
+      <w:r>
+        <w:rPr>
+          <w:rFonts w:ascii="Times New Roman" w:hAnsi="Times New Roman" w:cs="Times New Roman"/>
+        </w:rPr>
+        <w:t xml:space="preserve">, </w:t>
+      </w:r>
+      <w:proofErr w:type="spellStart"/>
+      <w:r>
+        <w:rPr>
+          <w:rFonts w:ascii="Times New Roman" w:hAnsi="Times New Roman" w:cs="Times New Roman"/>
+        </w:rPr>
+        <w:t>Model.Name</w:t>
+      </w:r>
+      <w:proofErr w:type="spellEnd"/>
+      <w:r>
+        <w:rPr>
+          <w:rFonts w:ascii="Times New Roman" w:hAnsi="Times New Roman" w:cs="Times New Roman"/>
+        </w:rPr>
+        <w:t xml:space="preserve">, </w:t>
+      </w:r>
+      <w:proofErr w:type="spellStart"/>
+      <w:proofErr w:type="gramStart"/>
+      <w:r>
+        <w:rPr>
+          <w:rFonts w:ascii="Times New Roman" w:hAnsi="Times New Roman" w:cs="Times New Roman"/>
+        </w:rPr>
+        <w:t>Make</w:t>
+      </w:r>
+      <w:proofErr w:type="gramEnd"/>
+      <w:r>
+        <w:rPr>
+          <w:rFonts w:ascii="Times New Roman" w:hAnsi="Times New Roman" w:cs="Times New Roman"/>
+        </w:rPr>
+        <w:t>.Id</w:t>
+      </w:r>
+      <w:proofErr w:type="spellEnd"/>
+      <w:r>
+        <w:rPr>
+          <w:rFonts w:ascii="Times New Roman" w:hAnsi="Times New Roman" w:cs="Times New Roman"/>
+        </w:rPr>
+        <w:t xml:space="preserve">, </w:t>
+      </w:r>
+      <w:proofErr w:type="spellStart"/>
+      <w:r>
+        <w:rPr>
+          <w:rFonts w:ascii="Times New Roman" w:hAnsi="Times New Roman" w:cs="Times New Roman"/>
+        </w:rPr>
+        <w:t>Model.Id</w:t>
+      </w:r>
+      <w:proofErr w:type="spellEnd"/>
+      <w:r>
+        <w:rPr>
+          <w:rFonts w:ascii="Times New Roman" w:hAnsi="Times New Roman" w:cs="Times New Roman"/>
+        </w:rPr>
+        <w:t xml:space="preserve"> FROM Make, Model WHERE </w:t>
+      </w:r>
+      <w:proofErr w:type="spellStart"/>
+      <w:proofErr w:type="gramStart"/>
+      <w:r>
+        <w:rPr>
+          <w:rFonts w:ascii="Times New Roman" w:hAnsi="Times New Roman" w:cs="Times New Roman"/>
+        </w:rPr>
+        <w:t>Make.Id</w:t>
+      </w:r>
+      <w:proofErr w:type="spellEnd"/>
+      <w:r>
+        <w:rPr>
+          <w:rFonts w:ascii="Times New Roman" w:hAnsi="Times New Roman" w:cs="Times New Roman"/>
+        </w:rPr>
+        <w:t xml:space="preserve"> !</w:t>
+      </w:r>
+      <w:proofErr w:type="gramEnd"/>
+      <w:r>
+        <w:rPr>
+          <w:rFonts w:ascii="Times New Roman" w:hAnsi="Times New Roman" w:cs="Times New Roman"/>
+        </w:rPr>
+        <w:t xml:space="preserve">= ? AND </w:t>
+      </w:r>
+      <w:proofErr w:type="spellStart"/>
+      <w:proofErr w:type="gramStart"/>
+      <w:r>
+        <w:rPr>
+          <w:rFonts w:ascii="Times New Roman" w:hAnsi="Times New Roman" w:cs="Times New Roman"/>
+        </w:rPr>
+        <w:t>Model.Id</w:t>
+      </w:r>
+      <w:proofErr w:type="spellEnd"/>
+      <w:r>
+        <w:rPr>
+          <w:rFonts w:ascii="Times New Roman" w:hAnsi="Times New Roman" w:cs="Times New Roman"/>
+        </w:rPr>
+        <w:t xml:space="preserve"> !</w:t>
+      </w:r>
+      <w:proofErr w:type="gramEnd"/>
+      <w:r>
+        <w:rPr>
+          <w:rFonts w:ascii="Times New Roman" w:hAnsi="Times New Roman" w:cs="Times New Roman"/>
+        </w:rPr>
+        <w:t xml:space="preserve">= ? AND </w:t>
+      </w:r>
+      <w:proofErr w:type="spellStart"/>
+      <w:r>
+        <w:rPr>
+          <w:rFonts w:ascii="Times New Roman" w:hAnsi="Times New Roman" w:cs="Times New Roman"/>
+        </w:rPr>
+        <w:t>Model.Make</w:t>
+      </w:r>
+      <w:proofErr w:type="spellEnd"/>
+      <w:r>
+        <w:rPr>
+          <w:rFonts w:ascii="Times New Roman" w:hAnsi="Times New Roman" w:cs="Times New Roman"/>
+        </w:rPr>
+        <w:t xml:space="preserve"> = </w:t>
+      </w:r>
+      <w:proofErr w:type="spellStart"/>
+      <w:r>
+        <w:rPr>
+          <w:rFonts w:ascii="Times New Roman" w:hAnsi="Times New Roman" w:cs="Times New Roman"/>
+        </w:rPr>
+        <w:t>Make.Id</w:t>
+      </w:r>
+      <w:proofErr w:type="spellEnd"/>
+    </w:p>
+    <w:p>
+      <w:pPr>
+        <w:rPr>
+          <w:rFonts w:ascii="Times New Roman" w:hAnsi="Times New Roman" w:cs="Times New Roman"/>
+        </w:rPr>
+      </w:pPr>
+      <w:r>
+        <w:rPr>
+          <w:rFonts w:ascii="Times New Roman" w:hAnsi="Times New Roman" w:cs="Times New Roman"/>
+        </w:rPr>
+        <w:t>DELETE FROM Car WHERE Id = %d</w:t>
+      </w:r>
+    </w:p>
+    <w:p>
+      <w:pPr>
+        <w:rPr>
+          <w:rFonts w:ascii="Times New Roman" w:hAnsi="Times New Roman" w:cs="Times New Roman"/>
+        </w:rPr>
+      </w:pPr>
+      <w:r>
+        <w:rPr>
+          <w:rFonts w:ascii="Times New Roman" w:hAnsi="Times New Roman" w:cs="Times New Roman"/>
+        </w:rPr>
+        <w:t xml:space="preserve">INSERT INTO Car (Color, Year, Make, Model, Value, Mileage, </w:t>
+      </w:r>
+      <w:proofErr w:type="spellStart"/>
+      <w:r>
+        <w:rPr>
+          <w:rFonts w:ascii="Times New Roman" w:hAnsi="Times New Roman" w:cs="Times New Roman"/>
+        </w:rPr>
+        <w:t>LicPlate</w:t>
+      </w:r>
+      <w:proofErr w:type="spellEnd"/>
+      <w:r>
+        <w:rPr>
+          <w:rFonts w:ascii="Times New Roman" w:hAnsi="Times New Roman" w:cs="Times New Roman"/>
+        </w:rPr>
+        <w:t xml:space="preserve">, </w:t>
+      </w:r>
+      <w:proofErr w:type="spellStart"/>
+      <w:r>
+        <w:rPr>
+          <w:rFonts w:ascii="Times New Roman" w:hAnsi="Times New Roman" w:cs="Times New Roman"/>
+        </w:rPr>
+        <w:t>Miles_PerGal</w:t>
+      </w:r>
+      <w:proofErr w:type="spellEnd"/>
+      <w:r>
+        <w:rPr>
+          <w:rFonts w:ascii="Times New Roman" w:hAnsi="Times New Roman" w:cs="Times New Roman"/>
+        </w:rPr>
+        <w:t>, Vin)</w:t>
+      </w:r>
+      <w:r>
+        <w:rPr>
+          <w:rFonts w:ascii="Times New Roman" w:hAnsi="Times New Roman" w:cs="Times New Roman"/>
+        </w:rPr>
+        <w:t xml:space="preserve"> </w:t>
+      </w:r>
+      <w:r>
+        <w:rPr>
+          <w:rFonts w:ascii="Times New Roman" w:hAnsi="Times New Roman" w:cs="Times New Roman"/>
+        </w:rPr>
+        <w:t xml:space="preserve">VALUES </w:t>
+      </w:r>
+      <w:proofErr w:type="gramStart"/>
+      <w:r>
+        <w:rPr>
+          <w:rFonts w:ascii="Times New Roman" w:hAnsi="Times New Roman" w:cs="Times New Roman"/>
+        </w:rPr>
+        <w:t>(?,</w:t>
+      </w:r>
+      <w:proofErr w:type="gramEnd"/>
+      <w:r>
+        <w:rPr>
+          <w:rFonts w:ascii="Times New Roman" w:hAnsi="Times New Roman" w:cs="Times New Roman"/>
+        </w:rPr>
+        <w:t xml:space="preserve"> ?, ?</w:t>
+      </w:r>
+      <w:proofErr w:type="gramStart"/>
+      <w:r>
+        <w:rPr>
+          <w:rFonts w:ascii="Times New Roman" w:hAnsi="Times New Roman" w:cs="Times New Roman"/>
+        </w:rPr>
+        <w:t>, ?</w:t>
+      </w:r>
+      <w:proofErr w:type="gramEnd"/>
+      <w:r>
+        <w:rPr>
+          <w:rFonts w:ascii="Times New Roman" w:hAnsi="Times New Roman" w:cs="Times New Roman"/>
+        </w:rPr>
+        <w:t>, ?</w:t>
+      </w:r>
+      <w:proofErr w:type="gramStart"/>
+      <w:r>
+        <w:rPr>
+          <w:rFonts w:ascii="Times New Roman" w:hAnsi="Times New Roman" w:cs="Times New Roman"/>
+        </w:rPr>
+        <w:t>, ?</w:t>
+      </w:r>
+      <w:proofErr w:type="gramEnd"/>
+      <w:r>
+        <w:rPr>
+          <w:rFonts w:ascii="Times New Roman" w:hAnsi="Times New Roman" w:cs="Times New Roman"/>
+        </w:rPr>
+        <w:t>, ?, ?, ?)</w:t>
+      </w:r>
+    </w:p>
+    <w:p>
+      <w:pPr>
+        <w:rPr>
+          <w:rFonts w:ascii="Times New Roman" w:hAnsi="Times New Roman" w:cs="Times New Roman"/>
+        </w:rPr>
+      </w:pPr>
+      <w:r>
+        <w:rPr>
+          <w:rFonts w:ascii="Times New Roman" w:hAnsi="Times New Roman" w:cs="Times New Roman"/>
+        </w:rPr>
+        <w:t xml:space="preserve">SELECT * FROM Car WHERE Value </w:t>
+      </w:r>
+      <w:proofErr w:type="gramStart"/>
+      <w:r>
+        <w:rPr>
+          <w:rFonts w:ascii="Times New Roman" w:hAnsi="Times New Roman" w:cs="Times New Roman"/>
+        </w:rPr>
+        <w:t>&gt; ?</w:t>
+      </w:r>
+      <w:proofErr w:type="gramEnd"/>
+    </w:p>
+    <w:p>
+      <w:pPr>
+        <w:rPr>
+          <w:rFonts w:ascii="Times New Roman" w:hAnsi="Times New Roman" w:cs="Times New Roman"/>
+        </w:rPr>
+      </w:pPr>
+      <w:r>
+        <w:rPr>
+          <w:rFonts w:ascii="Times New Roman" w:hAnsi="Times New Roman" w:cs="Times New Roman"/>
+        </w:rPr>
+        <w:t xml:space="preserve">SELECT * FROM Car WHERE Value </w:t>
+      </w:r>
+      <w:proofErr w:type="gramStart"/>
+      <w:r>
+        <w:rPr>
+          <w:rFonts w:ascii="Times New Roman" w:hAnsi="Times New Roman" w:cs="Times New Roman"/>
+        </w:rPr>
+        <w:t>&lt; ?</w:t>
+      </w:r>
+      <w:proofErr w:type="gramEnd"/>
+    </w:p>
+    <w:p>
+      <w:pPr>
+        <w:rPr>
+          <w:rFonts w:ascii="Times New Roman" w:hAnsi="Times New Roman" w:cs="Times New Roman"/>
+        </w:rPr>
+      </w:pPr>
+      <w:r>
+        <w:rPr>
+          <w:rFonts w:ascii="Times New Roman" w:hAnsi="Times New Roman" w:cs="Times New Roman"/>
+        </w:rPr>
+        <w:t xml:space="preserve">UPDATE Car SET Make </w:t>
+      </w:r>
+      <w:proofErr w:type="gramStart"/>
+      <w:r>
+        <w:rPr>
+          <w:rFonts w:ascii="Times New Roman" w:hAnsi="Times New Roman" w:cs="Times New Roman"/>
+        </w:rPr>
+        <w:t>= ?</w:t>
+      </w:r>
+      <w:proofErr w:type="gramEnd"/>
+      <w:r>
+        <w:rPr>
+          <w:rFonts w:ascii="Times New Roman" w:hAnsi="Times New Roman" w:cs="Times New Roman"/>
+        </w:rPr>
+        <w:t xml:space="preserve">, Model </w:t>
+      </w:r>
+      <w:proofErr w:type="gramStart"/>
+      <w:r>
+        <w:rPr>
+          <w:rFonts w:ascii="Times New Roman" w:hAnsi="Times New Roman" w:cs="Times New Roman"/>
+        </w:rPr>
+        <w:t>= ?</w:t>
+      </w:r>
+      <w:proofErr w:type="gramEnd"/>
+      <w:r>
+        <w:rPr>
+          <w:rFonts w:ascii="Times New Roman" w:hAnsi="Times New Roman" w:cs="Times New Roman"/>
+        </w:rPr>
+        <w:t xml:space="preserve">, Year </w:t>
+      </w:r>
+      <w:proofErr w:type="gramStart"/>
+      <w:r>
+        <w:rPr>
+          <w:rFonts w:ascii="Times New Roman" w:hAnsi="Times New Roman" w:cs="Times New Roman"/>
+        </w:rPr>
+        <w:t>= ?</w:t>
+      </w:r>
+      <w:proofErr w:type="gramEnd"/>
+      <w:r>
+        <w:rPr>
+          <w:rFonts w:ascii="Times New Roman" w:hAnsi="Times New Roman" w:cs="Times New Roman"/>
+        </w:rPr>
+        <w:t xml:space="preserve">, Color </w:t>
+      </w:r>
+      <w:proofErr w:type="gramStart"/>
+      <w:r>
+        <w:rPr>
+          <w:rFonts w:ascii="Times New Roman" w:hAnsi="Times New Roman" w:cs="Times New Roman"/>
+        </w:rPr>
+        <w:t>= ?</w:t>
+      </w:r>
+      <w:proofErr w:type="gramEnd"/>
+      <w:r>
+        <w:rPr>
+          <w:rFonts w:ascii="Times New Roman" w:hAnsi="Times New Roman" w:cs="Times New Roman"/>
+        </w:rPr>
+        <w:t xml:space="preserve">, Value </w:t>
+      </w:r>
+      <w:proofErr w:type="gramStart"/>
+      <w:r>
+        <w:rPr>
+          <w:rFonts w:ascii="Times New Roman" w:hAnsi="Times New Roman" w:cs="Times New Roman"/>
+        </w:rPr>
+        <w:t>= ?</w:t>
+      </w:r>
+      <w:proofErr w:type="gramEnd"/>
+      <w:r>
+        <w:rPr>
+          <w:rFonts w:ascii="Times New Roman" w:hAnsi="Times New Roman" w:cs="Times New Roman"/>
+        </w:rPr>
+        <w:t xml:space="preserve">, Mileage </w:t>
+      </w:r>
+      <w:proofErr w:type="gramStart"/>
+      <w:r>
+        <w:rPr>
+          <w:rFonts w:ascii="Times New Roman" w:hAnsi="Times New Roman" w:cs="Times New Roman"/>
+        </w:rPr>
+        <w:t>= ?</w:t>
+      </w:r>
+      <w:proofErr w:type="gramEnd"/>
+      <w:r>
+        <w:rPr>
+          <w:rFonts w:ascii="Times New Roman" w:hAnsi="Times New Roman" w:cs="Times New Roman"/>
+        </w:rPr>
+        <w:t xml:space="preserve">, </w:t>
+      </w:r>
+      <w:proofErr w:type="spellStart"/>
+      <w:r>
+        <w:rPr>
+          <w:rFonts w:ascii="Times New Roman" w:hAnsi="Times New Roman" w:cs="Times New Roman"/>
+        </w:rPr>
+        <w:t>Miles_PerGal</w:t>
+      </w:r>
+      <w:proofErr w:type="spellEnd"/>
+      <w:r>
+        <w:rPr>
+          <w:rFonts w:ascii="Times New Roman" w:hAnsi="Times New Roman" w:cs="Times New Roman"/>
+        </w:rPr>
+        <w:t xml:space="preserve"> </w:t>
+      </w:r>
+      <w:proofErr w:type="gramStart"/>
+      <w:r>
+        <w:rPr>
+          <w:rFonts w:ascii="Times New Roman" w:hAnsi="Times New Roman" w:cs="Times New Roman"/>
+        </w:rPr>
+        <w:t>= ?</w:t>
+      </w:r>
+      <w:proofErr w:type="gramEnd"/>
+      <w:r>
+        <w:rPr>
+          <w:rFonts w:ascii="Times New Roman" w:hAnsi="Times New Roman" w:cs="Times New Roman"/>
+        </w:rPr>
+        <w:t xml:space="preserve"> WHERE Id </w:t>
+      </w:r>
+      <w:proofErr w:type="gramStart"/>
+      <w:r>
+        <w:rPr>
+          <w:rFonts w:ascii="Times New Roman" w:hAnsi="Times New Roman" w:cs="Times New Roman"/>
+        </w:rPr>
+        <w:t>= ?</w:t>
+      </w:r>
+      <w:proofErr w:type="gramEnd"/>
+    </w:p>
+    <w:p>
+      <w:pPr>
+        <w:rPr>
+          <w:rFonts w:ascii="Times New Roman" w:hAnsi="Times New Roman" w:cs="Times New Roman"/>
+        </w:rPr>
+      </w:pPr>
+      <w:r>
+        <w:rPr>
+          <w:rFonts w:ascii="Times New Roman" w:hAnsi="Times New Roman" w:cs="Times New Roman"/>
+        </w:rPr>
+        <w:t xml:space="preserve">SELECT Name FROM Model WHERE Make </w:t>
+      </w:r>
+      <w:proofErr w:type="gramStart"/>
+      <w:r>
+        <w:rPr>
+          <w:rFonts w:ascii="Times New Roman" w:hAnsi="Times New Roman" w:cs="Times New Roman"/>
+        </w:rPr>
+        <w:t>= ?</w:t>
+      </w:r>
+      <w:proofErr w:type="gramEnd"/>
+    </w:p>
+    <w:p>
+      <w:pPr>
+        <w:rPr>
+          <w:rFonts w:ascii="Times New Roman" w:hAnsi="Times New Roman" w:cs="Times New Roman"/>
+        </w:rPr>
+      </w:pPr>
+      <w:r>
+        <w:rPr>
+          <w:rFonts w:ascii="Times New Roman" w:hAnsi="Times New Roman" w:cs="Times New Roman"/>
+        </w:rPr>
+        <w:t xml:space="preserve">INSERT INTO Record (Employee, Time, </w:t>
+      </w:r>
+      <w:proofErr w:type="spellStart"/>
+      <w:r>
+        <w:rPr>
+          <w:rFonts w:ascii="Times New Roman" w:hAnsi="Times New Roman" w:cs="Times New Roman"/>
+        </w:rPr>
         <w:t>ActionType</w:t>
       </w:r>
       <w:proofErr w:type="spellEnd"/>
-    </w:p>
-    <w:p>
-      <w:pPr>
-        <w:rPr>
-          <w:rFonts w:ascii="Times New Roman" w:hAnsi="Times New Roman" w:cs="Times New Roman"/>
-        </w:rPr>
-      </w:pPr>
-      <w:r>
-        <w:rPr>
-          <w:rFonts w:ascii="Times New Roman" w:hAnsi="Times New Roman" w:cs="Times New Roman"/>
-        </w:rPr>
-        <w:t>Employee:</w:t>
-      </w:r>
-    </w:p>
-    <w:p>
-      <w:pPr>
-        <w:rPr>
-          <w:rFonts w:ascii="Times New Roman" w:hAnsi="Times New Roman" w:cs="Times New Roman"/>
-        </w:rPr>
-      </w:pPr>
-      <w:r>
-        <w:rPr>
-          <w:rFonts w:ascii="Times New Roman" w:hAnsi="Times New Roman" w:cs="Times New Roman"/>
-        </w:rPr>
-        <w:t>Id (pk), Username</w:t>
-      </w:r>
-      <w:r>
-        <w:rPr>
-          <w:rFonts w:ascii="Times New Roman" w:hAnsi="Times New Roman" w:cs="Times New Roman"/>
-        </w:rPr>
-        <w:t>, Password, Salt</w:t>
-      </w:r>
-    </w:p>
-    <w:p>
-      <w:pPr>
-        <w:rPr>
-          <w:rFonts w:ascii="Times New Roman" w:hAnsi="Times New Roman" w:cs="Times New Roman"/>
-        </w:rPr>
-      </w:pPr>
-      <w:r>
-        <w:rPr>
-          <w:rFonts w:ascii="Times New Roman" w:hAnsi="Times New Roman" w:cs="Times New Roman"/>
-        </w:rPr>
-        <w:t>Make:</w:t>
-      </w:r>
-    </w:p>
-    <w:p>
-      <w:pPr>
-        <w:rPr>
-          <w:rFonts w:ascii="Times New Roman" w:hAnsi="Times New Roman" w:cs="Times New Roman"/>
-        </w:rPr>
-      </w:pPr>
-      <w:r>
-        <w:rPr>
-          <w:rFonts w:ascii="Times New Roman" w:hAnsi="Times New Roman" w:cs="Times New Roman"/>
-        </w:rPr>
-        <w:t>Id (pk), Name</w:t>
-      </w:r>
-    </w:p>
-    <w:p>
-      <w:pPr>
-        <w:rPr>
-          <w:rFonts w:ascii="Times New Roman" w:hAnsi="Times New Roman" w:cs="Times New Roman"/>
-        </w:rPr>
-      </w:pPr>
-      <w:r>
-        <w:rPr>
-          <w:rFonts w:ascii="Times New Roman" w:hAnsi="Times New Roman" w:cs="Times New Roman"/>
-        </w:rPr>
-        <w:t>Model:</w:t>
-      </w:r>
-    </w:p>
-    <w:p>
-      <w:pPr>
-        <w:rPr>
-          <w:rFonts w:ascii="Times New Roman" w:hAnsi="Times New Roman" w:cs="Times New Roman"/>
-        </w:rPr>
-      </w:pPr>
-      <w:r>
-        <w:rPr>
-          <w:rFonts w:ascii="Times New Roman" w:hAnsi="Times New Roman" w:cs="Times New Roman"/>
-        </w:rPr>
-        <w:t xml:space="preserve">Id (pk), Name, </w:t>
-      </w:r>
-      <w:proofErr w:type="gramStart"/>
-      <w:r>
-        <w:rPr>
-          <w:rFonts w:ascii="Times New Roman" w:hAnsi="Times New Roman" w:cs="Times New Roman"/>
-        </w:rPr>
-        <w:t>Make</w:t>
-      </w:r>
-      <w:proofErr w:type="gramEnd"/>
-      <w:r>
-        <w:rPr>
-          <w:rFonts w:ascii="Times New Roman" w:hAnsi="Times New Roman" w:cs="Times New Roman"/>
-        </w:rPr>
-        <w:t xml:space="preserve"> (</w:t>
+      <w:r>
+        <w:rPr>
+          <w:rFonts w:ascii="Times New Roman" w:hAnsi="Times New Roman" w:cs="Times New Roman"/>
+        </w:rPr>
+        <w:t>) VALUES ('%d', '%s', '%s')</w:t>
+      </w:r>
+    </w:p>
+    <w:p>
+      <w:pPr>
+        <w:rPr>
+          <w:rFonts w:ascii="Times New Roman" w:hAnsi="Times New Roman" w:cs="Times New Roman"/>
+        </w:rPr>
+      </w:pPr>
+      <w:r>
+        <w:rPr>
+          <w:rFonts w:ascii="Times New Roman" w:hAnsi="Times New Roman" w:cs="Times New Roman"/>
+        </w:rPr>
+        <w:t xml:space="preserve">CREATE TABLE IF NOT EXISTS Car(Id INTEGER PRIMARY KEY AUTOINCREMENT, Color TEXT NOT NULL, Year INTEGER NOT NULL, Make INTEGER NOT NULL, Model INTEGER NOT NULL, Value FLOAT NOT NULL, Mileage INTEGER NOT NULL, </w:t>
       </w:r>
       <w:proofErr w:type="spellStart"/>
       <w:r>
         <w:rPr>
           <w:rFonts w:ascii="Times New Roman" w:hAnsi="Times New Roman" w:cs="Times New Roman"/>
         </w:rPr>
-        <w:t>fk</w:t>
+        <w:t>LicPlate</w:t>
       </w:r>
       <w:proofErr w:type="spellEnd"/>
       <w:r>
         <w:rPr>
           <w:rFonts w:ascii="Times New Roman" w:hAnsi="Times New Roman" w:cs="Times New Roman"/>
         </w:rPr>
-        <w:t xml:space="preserve"> to </w:t>
+        <w:t xml:space="preserve"> VARCHAR(8) NOT NULL UNIQUE, </w:t>
       </w:r>
       <w:proofErr w:type="spellStart"/>
       <w:r>
         <w:rPr>
           <w:rFonts w:ascii="Times New Roman" w:hAnsi="Times New Roman" w:cs="Times New Roman"/>
         </w:rPr>
-        <w:t>Make.Id</w:t>
+        <w:t>Miles_PerGal</w:t>
       </w:r>
       <w:proofErr w:type="spellEnd"/>
       <w:r>
         <w:rPr>
           <w:rFonts w:ascii="Times New Roman" w:hAnsi="Times New Roman" w:cs="Times New Roman"/>
         </w:rPr>
-        <w:t>)</w:t>
-      </w:r>
-    </w:p>
-    <w:p>
-      <w:pPr>
-        <w:rPr>
-          <w:rFonts w:ascii="Times New Roman" w:hAnsi="Times New Roman" w:cs="Times New Roman"/>
-        </w:rPr>
-      </w:pPr>
-      <w:r>
-        <w:rPr>
-          <w:rFonts w:ascii="Times New Roman" w:hAnsi="Times New Roman" w:cs="Times New Roman"/>
-        </w:rPr>
-        <w:t>Car:</w:t>
-      </w:r>
-    </w:p>
-    <w:p>
-      <w:pPr>
-        <w:rPr>
-          <w:rFonts w:ascii="Times New Roman" w:hAnsi="Times New Roman" w:cs="Times New Roman"/>
-        </w:rPr>
-      </w:pPr>
-      <w:r>
-        <w:rPr>
-          <w:rFonts w:ascii="Times New Roman" w:hAnsi="Times New Roman" w:cs="Times New Roman"/>
-        </w:rPr>
-        <w:t xml:space="preserve">Id (pk), Color, </w:t>
-      </w:r>
-      <w:r>
-        <w:rPr>
-          <w:rFonts w:ascii="Times New Roman" w:hAnsi="Times New Roman" w:cs="Times New Roman"/>
-        </w:rPr>
-        <w:t xml:space="preserve">Year, </w:t>
-      </w:r>
-      <w:proofErr w:type="gramStart"/>
-      <w:r>
-        <w:rPr>
-          <w:rFonts w:ascii="Times New Roman" w:hAnsi="Times New Roman" w:cs="Times New Roman"/>
-        </w:rPr>
-        <w:t>Make</w:t>
-      </w:r>
-      <w:proofErr w:type="gramEnd"/>
-      <w:r>
-        <w:rPr>
-          <w:rFonts w:ascii="Times New Roman" w:hAnsi="Times New Roman" w:cs="Times New Roman"/>
-        </w:rPr>
-        <w:t xml:space="preserve"> (</w:t>
-      </w:r>
-      <w:proofErr w:type="spellStart"/>
-      <w:r>
-        <w:rPr>
-          <w:rFonts w:ascii="Times New Roman" w:hAnsi="Times New Roman" w:cs="Times New Roman"/>
-        </w:rPr>
-        <w:t>fk</w:t>
-      </w:r>
-      <w:proofErr w:type="spellEnd"/>
-      <w:r>
-        <w:rPr>
-          <w:rFonts w:ascii="Times New Roman" w:hAnsi="Times New Roman" w:cs="Times New Roman"/>
-        </w:rPr>
-        <w:t xml:space="preserve"> to </w:t>
-      </w:r>
-      <w:proofErr w:type="spellStart"/>
-      <w:r>
-        <w:rPr>
-          <w:rFonts w:ascii="Times New Roman" w:hAnsi="Times New Roman" w:cs="Times New Roman"/>
-        </w:rPr>
-        <w:t>Make.Id</w:t>
-      </w:r>
-      <w:proofErr w:type="spellEnd"/>
-      <w:r>
-        <w:rPr>
-          <w:rFonts w:ascii="Times New Roman" w:hAnsi="Times New Roman" w:cs="Times New Roman"/>
-        </w:rPr>
-        <w:t>), Model (</w:t>
-      </w:r>
-      <w:proofErr w:type="spellStart"/>
-      <w:r>
-        <w:rPr>
-          <w:rFonts w:ascii="Times New Roman" w:hAnsi="Times New Roman" w:cs="Times New Roman"/>
-        </w:rPr>
-        <w:t>fk</w:t>
-      </w:r>
-      <w:proofErr w:type="spellEnd"/>
-      <w:r>
-        <w:rPr>
-          <w:rFonts w:ascii="Times New Roman" w:hAnsi="Times New Roman" w:cs="Times New Roman"/>
-        </w:rPr>
-        <w:t xml:space="preserve"> to </w:t>
-      </w:r>
-      <w:proofErr w:type="spellStart"/>
-      <w:r>
-        <w:rPr>
-          <w:rFonts w:ascii="Times New Roman" w:hAnsi="Times New Roman" w:cs="Times New Roman"/>
-        </w:rPr>
-        <w:t>Model.Id</w:t>
-      </w:r>
-      <w:proofErr w:type="spellEnd"/>
-      <w:r>
-        <w:rPr>
-          <w:rFonts w:ascii="Times New Roman" w:hAnsi="Times New Roman" w:cs="Times New Roman"/>
-        </w:rPr>
-        <w:t xml:space="preserve">), </w:t>
-      </w:r>
-      <w:r>
-        <w:rPr>
-          <w:rFonts w:ascii="Times New Roman" w:hAnsi="Times New Roman" w:cs="Times New Roman"/>
-        </w:rPr>
-        <w:t xml:space="preserve">Value, Mileage, </w:t>
-      </w:r>
-      <w:proofErr w:type="spellStart"/>
-      <w:r>
-        <w:rPr>
-          <w:rFonts w:ascii="Times New Roman" w:hAnsi="Times New Roman" w:cs="Times New Roman"/>
-        </w:rPr>
-        <w:t>LicPlate</w:t>
-      </w:r>
-      <w:proofErr w:type="spellEnd"/>
-      <w:r>
-        <w:rPr>
-          <w:rFonts w:ascii="Times New Roman" w:hAnsi="Times New Roman" w:cs="Times New Roman"/>
-        </w:rPr>
-        <w:t xml:space="preserve">, </w:t>
-      </w:r>
-      <w:proofErr w:type="spellStart"/>
-      <w:r>
-        <w:rPr>
-          <w:rFonts w:ascii="Times New Roman" w:hAnsi="Times New Roman" w:cs="Times New Roman"/>
-        </w:rPr>
-        <w:t>Miles_PerGal</w:t>
-      </w:r>
-      <w:proofErr w:type="spellEnd"/>
-      <w:r>
-        <w:rPr>
-          <w:rFonts w:ascii="Times New Roman" w:hAnsi="Times New Roman" w:cs="Times New Roman"/>
-        </w:rPr>
-        <w:t>, Vin</w:t>
-      </w:r>
-    </w:p>
-    <w:p>
-      <w:pPr>
-        <w:rPr>
-          <w:rFonts w:ascii="Times New Roman" w:hAnsi="Times New Roman" w:cs="Times New Roman"/>
-        </w:rPr>
-      </w:pPr>
-    </w:p>
-    <w:p>
-      <w:pPr>
-        <w:rPr>
-          <w:rFonts w:ascii="Times New Roman" w:hAnsi="Times New Roman" w:cs="Times New Roman"/>
-        </w:rPr>
-      </w:pPr>
-    </w:p>
-    <w:p>
-      <w:pPr>
-        <w:rPr>
-          <w:rFonts w:ascii="Times New Roman" w:hAnsi="Times New Roman" w:cs="Times New Roman"/>
-        </w:rPr>
-      </w:pPr>
-    </w:p>
-    <w:p>
-      <w:pPr>
-        <w:rPr>
-          <w:rFonts w:ascii="Times New Roman" w:hAnsi="Times New Roman" w:cs="Times New Roman"/>
-        </w:rPr>
-      </w:pPr>
-    </w:p>
-    <w:p>
-      <w:pPr>
-        <w:rPr>
-          <w:rFonts w:ascii="Times New Roman" w:hAnsi="Times New Roman" w:cs="Times New Roman"/>
-        </w:rPr>
-      </w:pPr>
-    </w:p>
-    <w:p>
-      <w:pPr>
-        <w:rPr>
-          <w:rFonts w:ascii="Times New Roman" w:hAnsi="Times New Roman" w:cs="Times New Roman"/>
-        </w:rPr>
-      </w:pPr>
-    </w:p>
-    <w:p>
-      <w:pPr>
-        <w:rPr>
-          <w:rFonts w:ascii="Times New Roman" w:hAnsi="Times New Roman" w:cs="Times New Roman"/>
-        </w:rPr>
-      </w:pPr>
-    </w:p>
-    <w:p>
-      <w:pPr>
-        <w:rPr>
-          <w:rFonts w:ascii="Times New Roman" w:hAnsi="Times New Roman" w:cs="Times New Roman"/>
-        </w:rPr>
-      </w:pPr>
-    </w:p>
-    <w:p>
-      <w:pPr>
-        <w:rPr>
-          <w:rFonts w:ascii="Times New Roman" w:hAnsi="Times New Roman" w:cs="Times New Roman"/>
-        </w:rPr>
-      </w:pPr>
-    </w:p>
-    <w:p>
-      <w:pPr>
-        <w:rPr>
-          <w:rFonts w:ascii="Times New Roman" w:hAnsi="Times New Roman" w:cs="Times New Roman"/>
-        </w:rPr>
-      </w:pPr>
-    </w:p>
-    <w:p>
-      <w:pPr>
-        <w:rPr>
-          <w:rFonts w:ascii="Times New Roman" w:hAnsi="Times New Roman" w:cs="Times New Roman"/>
-        </w:rPr>
-      </w:pPr>
-    </w:p>
-    <w:p>
-      <w:pPr>
-        <w:rPr>
-          <w:rFonts w:ascii="Times New Roman" w:hAnsi="Times New Roman" w:cs="Times New Roman"/>
-        </w:rPr>
-      </w:pPr>
-    </w:p>
-    <w:p>
-      <w:pPr>
-        <w:rPr>
-          <w:rFonts w:ascii="Times New Roman" w:hAnsi="Times New Roman" w:cs="Times New Roman"/>
-        </w:rPr>
-      </w:pPr>
-    </w:p>
-    <w:p>
-      <w:pPr>
-        <w:rPr>
-          <w:rFonts w:ascii="Times New Roman" w:hAnsi="Times New Roman" w:cs="Times New Roman"/>
-          <w:b/>
-          <w:bCs/>
-        </w:rPr>
-      </w:pPr>
-    </w:p>
-    <w:p>
-      <w:pPr>
-        <w:jc w:val="center"/>
-        <w:rPr>
-          <w:rFonts w:ascii="Times New Roman" w:hAnsi="Times New Roman" w:cs="Times New Roman"/>
-          <w:b/>
-          <w:bCs/>
-        </w:rPr>
-      </w:pPr>
-      <w:r>
-        <w:rPr>
-          <w:rFonts w:ascii="Times New Roman" w:hAnsi="Times New Roman" w:cs="Times New Roman"/>
-          <w:b/>
-          <w:bCs/>
-        </w:rPr>
-        <w:lastRenderedPageBreak/>
-        <w:t>Implementation</w:t>
-      </w:r>
-    </w:p>
-    <w:p>
-      <w:pPr>
-        <w:rPr>
-          <w:rFonts w:ascii="Times New Roman" w:hAnsi="Times New Roman" w:cs="Times New Roman"/>
-        </w:rPr>
-      </w:pPr>
-    </w:p>
-    <w:p>
-      <w:pPr>
-        <w:rPr>
-          <w:rFonts w:ascii="Times New Roman" w:hAnsi="Times New Roman" w:cs="Times New Roman"/>
-        </w:rPr>
-      </w:pPr>
-    </w:p>
-    <w:p>
-      <w:pPr>
-        <w:rPr>
-          <w:rFonts w:ascii="Times New Roman" w:hAnsi="Times New Roman" w:cs="Times New Roman"/>
-        </w:rPr>
-      </w:pPr>
-    </w:p>
-    <w:p>
-      <w:pPr>
-        <w:rPr>
-          <w:rFonts w:ascii="Times New Roman" w:hAnsi="Times New Roman" w:cs="Times New Roman"/>
-        </w:rPr>
-      </w:pPr>
-    </w:p>
-    <w:p>
-      <w:pPr>
-        <w:rPr>
-          <w:rFonts w:ascii="Times New Roman" w:hAnsi="Times New Roman" w:cs="Times New Roman"/>
-        </w:rPr>
-      </w:pPr>
-    </w:p>
-    <w:p>
-      <w:pPr>
-        <w:rPr>
-          <w:rFonts w:ascii="Times New Roman" w:hAnsi="Times New Roman" w:cs="Times New Roman"/>
-        </w:rPr>
-      </w:pPr>
-    </w:p>
-    <w:p>
-      <w:pPr>
-        <w:rPr>
-          <w:rFonts w:ascii="Times New Roman" w:hAnsi="Times New Roman" w:cs="Times New Roman"/>
-        </w:rPr>
-      </w:pPr>
-    </w:p>
-    <w:p>
-      <w:pPr>
-        <w:rPr>
-          <w:rFonts w:ascii="Times New Roman" w:hAnsi="Times New Roman" w:cs="Times New Roman"/>
-        </w:rPr>
-      </w:pPr>
-    </w:p>
-    <w:p>
-      <w:pPr>
-        <w:rPr>
-          <w:rFonts w:ascii="Times New Roman" w:hAnsi="Times New Roman" w:cs="Times New Roman"/>
-        </w:rPr>
-      </w:pPr>
-    </w:p>
-    <w:p>
-      <w:pPr>
-        <w:rPr>
-          <w:rFonts w:ascii="Times New Roman" w:hAnsi="Times New Roman" w:cs="Times New Roman"/>
-        </w:rPr>
-      </w:pPr>
-    </w:p>
-    <w:p>
-      <w:pPr>
-        <w:rPr>
-          <w:rFonts w:ascii="Times New Roman" w:hAnsi="Times New Roman" w:cs="Times New Roman"/>
-        </w:rPr>
-      </w:pPr>
-    </w:p>
-    <w:p>
-      <w:pPr>
-        <w:rPr>
-          <w:rFonts w:ascii="Times New Roman" w:hAnsi="Times New Roman" w:cs="Times New Roman"/>
-        </w:rPr>
-      </w:pPr>
-    </w:p>
-    <w:p>
-      <w:pPr>
-        <w:rPr>
-          <w:rFonts w:ascii="Times New Roman" w:hAnsi="Times New Roman" w:cs="Times New Roman"/>
-        </w:rPr>
-      </w:pPr>
-    </w:p>
-    <w:p>
-      <w:pPr>
-        <w:rPr>
-          <w:rFonts w:ascii="Times New Roman" w:hAnsi="Times New Roman" w:cs="Times New Roman"/>
-        </w:rPr>
-      </w:pPr>
-    </w:p>
-    <w:p>
-      <w:pPr>
-        <w:rPr>
-          <w:rFonts w:ascii="Times New Roman" w:hAnsi="Times New Roman" w:cs="Times New Roman"/>
-        </w:rPr>
-      </w:pPr>
-    </w:p>
-    <w:p>
-      <w:pPr>
-        <w:rPr>
-          <w:rFonts w:ascii="Times New Roman" w:hAnsi="Times New Roman" w:cs="Times New Roman"/>
-        </w:rPr>
-      </w:pPr>
-    </w:p>
-    <w:p>
-      <w:pPr>
-        <w:rPr>
-          <w:rFonts w:ascii="Times New Roman" w:hAnsi="Times New Roman" w:cs="Times New Roman"/>
-        </w:rPr>
-      </w:pPr>
-    </w:p>
-    <w:p>
-      <w:pPr>
-        <w:rPr>
-          <w:rFonts w:ascii="Times New Roman" w:hAnsi="Times New Roman" w:cs="Times New Roman"/>
-        </w:rPr>
-      </w:pPr>
-    </w:p>
-    <w:p>
-      <w:pPr>
-        <w:rPr>
-          <w:rFonts w:ascii="Times New Roman" w:hAnsi="Times New Roman" w:cs="Times New Roman"/>
-        </w:rPr>
-      </w:pPr>
-    </w:p>
-    <w:p>
-      <w:pPr>
-        <w:rPr>
-          <w:rFonts w:ascii="Times New Roman" w:hAnsi="Times New Roman" w:cs="Times New Roman"/>
-        </w:rPr>
-      </w:pPr>
-    </w:p>
-    <w:p>
-      <w:pPr>
-        <w:rPr>
-          <w:rFonts w:ascii="Times New Roman" w:hAnsi="Times New Roman" w:cs="Times New Roman"/>
-        </w:rPr>
-      </w:pPr>
-    </w:p>
-    <w:p>
-      <w:pPr>
-        <w:rPr>
-          <w:rFonts w:ascii="Times New Roman" w:hAnsi="Times New Roman" w:cs="Times New Roman"/>
-        </w:rPr>
-      </w:pPr>
-    </w:p>
-    <w:p>
-      <w:pPr>
-        <w:rPr>
-          <w:rFonts w:ascii="Times New Roman" w:hAnsi="Times New Roman" w:cs="Times New Roman"/>
-        </w:rPr>
-      </w:pPr>
-    </w:p>
-    <w:p>
-      <w:pPr>
-        <w:rPr>
-          <w:rFonts w:ascii="Times New Roman" w:hAnsi="Times New Roman" w:cs="Times New Roman"/>
-        </w:rPr>
-      </w:pPr>
-    </w:p>
-    <w:p>
-      <w:pPr>
-        <w:rPr>
-          <w:rFonts w:ascii="Times New Roman" w:hAnsi="Times New Roman" w:cs="Times New Roman"/>
-        </w:rPr>
-      </w:pPr>
-    </w:p>
-    <w:p>
-      <w:pPr>
-        <w:jc w:val="center"/>
-        <w:rPr>
-          <w:rFonts w:ascii="Times New Roman" w:hAnsi="Times New Roman" w:cs="Times New Roman"/>
-          <w:b/>
-          <w:bCs/>
-        </w:rPr>
-      </w:pPr>
+        <w:t xml:space="preserve"> INTEGER NOT NULL, Vin TEXT NOT NULL UNIQUE, FOREIGN KEY (Make) REFERENCES Make(Id), FOREIGN KEY (Model) REFERENCES Model(Id))</w:t>
+      </w:r>
+    </w:p>
+    <w:p>
+      <w:pPr>
+        <w:rPr>
+          <w:rFonts w:ascii="Times New Roman" w:hAnsi="Times New Roman" w:cs="Times New Roman"/>
+        </w:rPr>
+      </w:pPr>
+      <w:r>
+        <w:rPr>
+          <w:rFonts w:ascii="Times New Roman" w:hAnsi="Times New Roman" w:cs="Times New Roman"/>
+        </w:rPr>
+        <w:t>Finally, the project’s html files all contain the navbar for easy navigation around the site.</w:t>
+      </w:r>
     </w:p>
     <w:p>
       <w:pPr>
@@ -2513,6 +4816,25 @@
       <w:spacing w:val="5"/>
     </w:rPr>
   </w:style>
+  <w:style w:type="table" w:styleId="TableGrid">
+    <w:name w:val="Table Grid"/>
+    <w:basedOn w:val="TableNormal"/>
+    <w:uiPriority w:val="39"/>
+    <w:rsid w:val="00971910"/>
+    <w:pPr>
+      <w:spacing w:after="0" w:line="240" w:lineRule="auto"/>
+    </w:pPr>
+    <w:tblPr>
+      <w:tblBorders>
+        <w:top w:val="single" w:sz="4" w:space="0" w:color="auto"/>
+        <w:left w:val="single" w:sz="4" w:space="0" w:color="auto"/>
+        <w:bottom w:val="single" w:sz="4" w:space="0" w:color="auto"/>
+        <w:right w:val="single" w:sz="4" w:space="0" w:color="auto"/>
+        <w:insideH w:val="single" w:sz="4" w:space="0" w:color="auto"/>
+        <w:insideV w:val="single" w:sz="4" w:space="0" w:color="auto"/>
+      </w:tblBorders>
+    </w:tblPr>
+  </w:style>
 </w:styles>
 </file>
 

</xml_diff>